<commit_message>
CDS and RiskyBondPricer Module 20240212 updated
</commit_message>
<xml_diff>
--- a/CreditDerivatives/CDS 사용 설명서.docx
+++ b/CreditDerivatives/CDS 사용 설명서.docx
@@ -36,6 +36,71 @@
           <w:szCs w:val="24"/>
         </w:rPr>
         <w:t>설명서</w:t>
+      </w:r>
+    </w:p>
+    <w:p>
+      <w:pPr>
+        <w:jc w:val="center"/>
+        <w:rPr>
+          <w:rFonts w:hint="eastAsia"/>
+          <w:b/>
+          <w:sz w:val="24"/>
+          <w:szCs w:val="24"/>
+        </w:rPr>
+      </w:pPr>
+    </w:p>
+    <w:p>
+      <w:pPr>
+        <w:jc w:val="left"/>
+        <w:rPr>
+          <w:rFonts w:hint="eastAsia"/>
+          <w:b/>
+          <w:sz w:val="24"/>
+          <w:szCs w:val="24"/>
+        </w:rPr>
+      </w:pPr>
+      <w:r>
+        <w:rPr>
+          <w:rFonts w:hint="eastAsia"/>
+          <w:b/>
+          <w:sz w:val="24"/>
+          <w:szCs w:val="24"/>
+        </w:rPr>
+        <w:t>DLL</w:t>
+      </w:r>
+      <w:r>
+        <w:rPr>
+          <w:b/>
+          <w:sz w:val="24"/>
+          <w:szCs w:val="24"/>
+        </w:rPr>
+        <w:t xml:space="preserve"> </w:t>
+      </w:r>
+      <w:r>
+        <w:rPr>
+          <w:rFonts w:hint="eastAsia"/>
+          <w:b/>
+          <w:sz w:val="24"/>
+          <w:szCs w:val="24"/>
+        </w:rPr>
+        <w:t>경로를 찾을 수 없을 경우 1</w:t>
+      </w:r>
+      <w:r>
+        <w:rPr>
+          <w:b/>
+          <w:sz w:val="24"/>
+          <w:szCs w:val="24"/>
+        </w:rPr>
+        <w:t>~3</w:t>
+      </w:r>
+      <w:r>
+        <w:rPr>
+          <w:rFonts w:hint="eastAsia"/>
+          <w:b/>
+          <w:sz w:val="24"/>
+          <w:szCs w:val="24"/>
+        </w:rPr>
+        <w:t>을 따라 세팅합니다.</w:t>
       </w:r>
     </w:p>
     <w:p/>
@@ -196,6 +261,15 @@
     <w:p>
       <w:pPr>
         <w:pStyle w:val="a3"/>
+        <w:ind w:leftChars="0" w:left="760"/>
+        <w:rPr>
+          <w:rFonts w:hint="eastAsia"/>
+        </w:rPr>
+      </w:pPr>
+    </w:p>
+    <w:p>
+      <w:pPr>
+        <w:pStyle w:val="a3"/>
         <w:numPr>
           <w:ilvl w:val="0"/>
           <w:numId w:val="1"/>
@@ -297,6 +371,7 @@
           <w:rFonts w:hint="eastAsia"/>
           <w:noProof/>
         </w:rPr>
+        <w:lastRenderedPageBreak/>
         <w:drawing>
           <wp:inline distT="0" distB="0" distL="0" distR="0">
             <wp:extent cx="5177640" cy="3284220"/>
@@ -353,7 +428,6 @@
         <w:ind w:leftChars="0" w:left="760"/>
       </w:pPr>
       <w:r>
-        <w:lastRenderedPageBreak/>
         <w:t xml:space="preserve">3-2. </w:t>
       </w:r>
       <w:r>
@@ -436,6 +510,7 @@
         <w:rPr>
           <w:noProof/>
         </w:rPr>
+        <w:lastRenderedPageBreak/>
         <w:drawing>
           <wp:inline distT="0" distB="0" distL="0" distR="0" wp14:anchorId="65DE90AE" wp14:editId="445FA7A9">
             <wp:extent cx="5731510" cy="2729865"/>
@@ -516,7 +591,6 @@
         <w:rPr>
           <w:noProof/>
         </w:rPr>
-        <w:lastRenderedPageBreak/>
         <w:drawing>
           <wp:inline distT="0" distB="0" distL="0" distR="0" wp14:anchorId="50314739" wp14:editId="0A176DF3">
             <wp:extent cx="5731510" cy="2406650"/>
@@ -621,6 +695,7 @@
         <w:rPr>
           <w:noProof/>
         </w:rPr>
+        <w:lastRenderedPageBreak/>
         <w:drawing>
           <wp:inline distT="0" distB="0" distL="0" distR="0" wp14:anchorId="1646760C" wp14:editId="23C9E042">
             <wp:extent cx="2802731" cy="1676400"/>
@@ -664,16 +739,13 @@
         <w:ind w:leftChars="0" w:left="760"/>
       </w:pPr>
     </w:p>
-    <w:p/>
-    <w:p/>
-    <w:p/>
-    <w:p/>
-    <w:p/>
-    <w:p/>
-    <w:p/>
-    <w:p/>
-    <w:p/>
-    <w:p/>
+    <w:p>
+      <w:pPr>
+        <w:rPr>
+          <w:rFonts w:hint="eastAsia"/>
+        </w:rPr>
+      </w:pPr>
+    </w:p>
     <w:p>
       <w:pPr>
         <w:jc w:val="center"/>
@@ -688,7 +760,6 @@
           <w:b/>
           <w:sz w:val="24"/>
         </w:rPr>
-        <w:lastRenderedPageBreak/>
         <w:t>함수 매핑 정의서</w:t>
       </w:r>
     </w:p>
@@ -858,7 +929,7 @@
           <w:sz w:val="19"/>
           <w:szCs w:val="19"/>
         </w:rPr>
-        <w:t>NPremiumCurve</w:t>
+        <w:t>PricingDateYYYYMMDD</w:t>
       </w:r>
       <w:r>
         <w:rPr>
@@ -879,56 +950,6 @@
           <w:szCs w:val="19"/>
         </w:rPr>
         <w:tab/>
-      </w:r>
-      <w:r>
-        <w:rPr>
-          <w:rFonts w:ascii="돋움체" w:eastAsia="돋움체" w:cs="돋움체"/>
-          <w:color w:val="000000"/>
-          <w:kern w:val="0"/>
-          <w:sz w:val="19"/>
-          <w:szCs w:val="19"/>
-        </w:rPr>
-        <w:tab/>
-      </w:r>
-      <w:r>
-        <w:rPr>
-          <w:rFonts w:ascii="돋움체" w:eastAsia="돋움체" w:cs="돋움체"/>
-          <w:color w:val="008000"/>
-          <w:kern w:val="0"/>
-          <w:sz w:val="19"/>
-          <w:szCs w:val="19"/>
-        </w:rPr>
-        <w:t xml:space="preserve">// Premium Leg </w:t>
-      </w:r>
-      <w:r>
-        <w:rPr>
-          <w:rFonts w:ascii="돋움체" w:eastAsia="돋움체" w:cs="돋움체" w:hint="eastAsia"/>
-          <w:color w:val="008000"/>
-          <w:kern w:val="0"/>
-          <w:sz w:val="19"/>
-          <w:szCs w:val="19"/>
-        </w:rPr>
-        <w:t>커브</w:t>
-      </w:r>
-      <w:r>
-        <w:rPr>
-          <w:rFonts w:ascii="돋움체" w:eastAsia="돋움체" w:cs="돋움체"/>
-          <w:color w:val="008000"/>
-          <w:kern w:val="0"/>
-          <w:sz w:val="19"/>
-          <w:szCs w:val="19"/>
-        </w:rPr>
-        <w:t xml:space="preserve"> Term </w:t>
-      </w:r>
-      <w:r>
-        <w:rPr>
-          <w:rFonts w:ascii="돋움체" w:eastAsia="돋움체" w:cs="돋움체" w:hint="eastAsia"/>
-          <w:color w:val="008000"/>
-          <w:kern w:val="0"/>
-          <w:sz w:val="19"/>
-          <w:szCs w:val="19"/>
-        </w:rPr>
-        <w:t>개수</w:t>
       </w:r>
     </w:p>
     <w:p>
@@ -945,106 +966,6 @@
           <w:szCs w:val="19"/>
         </w:rPr>
       </w:pPr>
-      <w:r>
-        <w:rPr>
-          <w:rFonts w:ascii="돋움체" w:eastAsia="돋움체" w:cs="돋움체"/>
-          <w:color w:val="000000"/>
-          <w:kern w:val="0"/>
-          <w:sz w:val="19"/>
-          <w:szCs w:val="19"/>
-        </w:rPr>
-        <w:tab/>
-      </w:r>
-      <w:r>
-        <w:rPr>
-          <w:rFonts w:ascii="돋움체" w:eastAsia="돋움체" w:cs="돋움체"/>
-          <w:color w:val="0000FF"/>
-          <w:kern w:val="0"/>
-          <w:sz w:val="19"/>
-          <w:szCs w:val="19"/>
-        </w:rPr>
-        <w:t>double</w:t>
-      </w:r>
-      <w:r>
-        <w:rPr>
-          <w:rFonts w:ascii="돋움체" w:eastAsia="돋움체" w:cs="돋움체"/>
-          <w:color w:val="000000"/>
-          <w:kern w:val="0"/>
-          <w:sz w:val="19"/>
-          <w:szCs w:val="19"/>
-        </w:rPr>
-        <w:t xml:space="preserve">* </w:t>
-      </w:r>
-      <w:r>
-        <w:rPr>
-          <w:rFonts w:ascii="돋움체" w:eastAsia="돋움체" w:cs="돋움체"/>
-          <w:color w:val="808080"/>
-          <w:kern w:val="0"/>
-          <w:sz w:val="19"/>
-          <w:szCs w:val="19"/>
-        </w:rPr>
-        <w:t>PremiumCurveTerm</w:t>
-      </w:r>
-      <w:r>
-        <w:rPr>
-          <w:rFonts w:ascii="돋움체" w:eastAsia="돋움체" w:cs="돋움체"/>
-          <w:color w:val="000000"/>
-          <w:kern w:val="0"/>
-          <w:sz w:val="19"/>
-          <w:szCs w:val="19"/>
-        </w:rPr>
-        <w:t>,</w:t>
-      </w:r>
-      <w:r>
-        <w:rPr>
-          <w:rFonts w:ascii="돋움체" w:eastAsia="돋움체" w:cs="돋움체"/>
-          <w:color w:val="000000"/>
-          <w:kern w:val="0"/>
-          <w:sz w:val="19"/>
-          <w:szCs w:val="19"/>
-        </w:rPr>
-        <w:tab/>
-      </w:r>
-      <w:r>
-        <w:rPr>
-          <w:rFonts w:ascii="돋움체" w:eastAsia="돋움체" w:cs="돋움체"/>
-          <w:color w:val="000000"/>
-          <w:kern w:val="0"/>
-          <w:sz w:val="19"/>
-          <w:szCs w:val="19"/>
-        </w:rPr>
-        <w:tab/>
-      </w:r>
-      <w:r>
-        <w:rPr>
-          <w:rFonts w:ascii="돋움체" w:eastAsia="돋움체" w:cs="돋움체"/>
-          <w:color w:val="008000"/>
-          <w:kern w:val="0"/>
-          <w:sz w:val="19"/>
-          <w:szCs w:val="19"/>
-        </w:rPr>
-        <w:t xml:space="preserve">// Premium Leg </w:t>
-      </w:r>
-      <w:r>
-        <w:rPr>
-          <w:rFonts w:ascii="돋움체" w:eastAsia="돋움체" w:cs="돋움체" w:hint="eastAsia"/>
-          <w:color w:val="008000"/>
-          <w:kern w:val="0"/>
-          <w:sz w:val="19"/>
-          <w:szCs w:val="19"/>
-        </w:rPr>
-        <w:t>커브</w:t>
-      </w:r>
-      <w:r>
-        <w:rPr>
-          <w:rFonts w:ascii="돋움체" w:eastAsia="돋움체" w:cs="돋움체"/>
-          <w:color w:val="008000"/>
-          <w:kern w:val="0"/>
-          <w:sz w:val="19"/>
-          <w:szCs w:val="19"/>
-        </w:rPr>
-        <w:t xml:space="preserve"> Term Array</w:t>
-      </w:r>
     </w:p>
     <w:p>
       <w:pPr>
@@ -1078,17 +999,17 @@
           <w:sz w:val="19"/>
           <w:szCs w:val="19"/>
         </w:rPr>
-        <w:t>double</w:t>
-      </w:r>
-      <w:r>
-        <w:rPr>
-          <w:rFonts w:ascii="돋움체" w:eastAsia="돋움체" w:cs="돋움체"/>
-          <w:color w:val="000000"/>
-          <w:kern w:val="0"/>
-          <w:sz w:val="19"/>
-          <w:szCs w:val="19"/>
-        </w:rPr>
-        <w:t xml:space="preserve">* </w:t>
+        <w:t>long</w:t>
+      </w:r>
+      <w:r>
+        <w:rPr>
+          <w:rFonts w:ascii="돋움체" w:eastAsia="돋움체" w:cs="돋움체"/>
+          <w:color w:val="000000"/>
+          <w:kern w:val="0"/>
+          <w:sz w:val="19"/>
+          <w:szCs w:val="19"/>
+        </w:rPr>
+        <w:t xml:space="preserve"> </w:t>
       </w:r>
       <w:r>
         <w:rPr>
@@ -1098,7 +1019,7 @@
           <w:sz w:val="19"/>
           <w:szCs w:val="19"/>
         </w:rPr>
-        <w:t>PremiumCurve</w:t>
+        <w:t>NPremiumCurve</w:t>
       </w:r>
       <w:r>
         <w:rPr>
@@ -1158,7 +1079,17 @@
           <w:sz w:val="19"/>
           <w:szCs w:val="19"/>
         </w:rPr>
-        <w:t xml:space="preserve"> Rate Array</w:t>
+        <w:t xml:space="preserve"> Term </w:t>
+      </w:r>
+      <w:r>
+        <w:rPr>
+          <w:rFonts w:ascii="돋움체" w:eastAsia="돋움체" w:cs="돋움체" w:hint="eastAsia"/>
+          <w:color w:val="008000"/>
+          <w:kern w:val="0"/>
+          <w:sz w:val="19"/>
+          <w:szCs w:val="19"/>
+        </w:rPr>
+        <w:t>개수</w:t>
       </w:r>
     </w:p>
     <w:p>
@@ -1175,6 +1106,106 @@
           <w:szCs w:val="19"/>
         </w:rPr>
       </w:pPr>
+      <w:r>
+        <w:rPr>
+          <w:rFonts w:ascii="돋움체" w:eastAsia="돋움체" w:cs="돋움체"/>
+          <w:color w:val="000000"/>
+          <w:kern w:val="0"/>
+          <w:sz w:val="19"/>
+          <w:szCs w:val="19"/>
+        </w:rPr>
+        <w:tab/>
+      </w:r>
+      <w:r>
+        <w:rPr>
+          <w:rFonts w:ascii="돋움체" w:eastAsia="돋움체" w:cs="돋움체"/>
+          <w:color w:val="0000FF"/>
+          <w:kern w:val="0"/>
+          <w:sz w:val="19"/>
+          <w:szCs w:val="19"/>
+        </w:rPr>
+        <w:t>double</w:t>
+      </w:r>
+      <w:r>
+        <w:rPr>
+          <w:rFonts w:ascii="돋움체" w:eastAsia="돋움체" w:cs="돋움체"/>
+          <w:color w:val="000000"/>
+          <w:kern w:val="0"/>
+          <w:sz w:val="19"/>
+          <w:szCs w:val="19"/>
+        </w:rPr>
+        <w:t xml:space="preserve">* </w:t>
+      </w:r>
+      <w:r>
+        <w:rPr>
+          <w:rFonts w:ascii="돋움체" w:eastAsia="돋움체" w:cs="돋움체"/>
+          <w:color w:val="808080"/>
+          <w:kern w:val="0"/>
+          <w:sz w:val="19"/>
+          <w:szCs w:val="19"/>
+        </w:rPr>
+        <w:t>PremiumCurveTerm</w:t>
+      </w:r>
+      <w:r>
+        <w:rPr>
+          <w:rFonts w:ascii="돋움체" w:eastAsia="돋움체" w:cs="돋움체"/>
+          <w:color w:val="000000"/>
+          <w:kern w:val="0"/>
+          <w:sz w:val="19"/>
+          <w:szCs w:val="19"/>
+        </w:rPr>
+        <w:t>,</w:t>
+      </w:r>
+      <w:r>
+        <w:rPr>
+          <w:rFonts w:ascii="돋움체" w:eastAsia="돋움체" w:cs="돋움체"/>
+          <w:color w:val="000000"/>
+          <w:kern w:val="0"/>
+          <w:sz w:val="19"/>
+          <w:szCs w:val="19"/>
+        </w:rPr>
+        <w:tab/>
+      </w:r>
+      <w:r>
+        <w:rPr>
+          <w:rFonts w:ascii="돋움체" w:eastAsia="돋움체" w:cs="돋움체"/>
+          <w:color w:val="000000"/>
+          <w:kern w:val="0"/>
+          <w:sz w:val="19"/>
+          <w:szCs w:val="19"/>
+        </w:rPr>
+        <w:tab/>
+      </w:r>
+      <w:r>
+        <w:rPr>
+          <w:rFonts w:ascii="돋움체" w:eastAsia="돋움체" w:cs="돋움체"/>
+          <w:color w:val="008000"/>
+          <w:kern w:val="0"/>
+          <w:sz w:val="19"/>
+          <w:szCs w:val="19"/>
+        </w:rPr>
+        <w:t xml:space="preserve">// Premium Leg </w:t>
+      </w:r>
+      <w:r>
+        <w:rPr>
+          <w:rFonts w:ascii="돋움체" w:eastAsia="돋움체" w:cs="돋움체" w:hint="eastAsia"/>
+          <w:color w:val="008000"/>
+          <w:kern w:val="0"/>
+          <w:sz w:val="19"/>
+          <w:szCs w:val="19"/>
+        </w:rPr>
+        <w:t>커브</w:t>
+      </w:r>
+      <w:r>
+        <w:rPr>
+          <w:rFonts w:ascii="돋움체" w:eastAsia="돋움체" w:cs="돋움체"/>
+          <w:color w:val="008000"/>
+          <w:kern w:val="0"/>
+          <w:sz w:val="19"/>
+          <w:szCs w:val="19"/>
+        </w:rPr>
+        <w:t xml:space="preserve"> Term Array</w:t>
+      </w:r>
     </w:p>
     <w:p>
       <w:pPr>
@@ -1208,17 +1239,17 @@
           <w:sz w:val="19"/>
           <w:szCs w:val="19"/>
         </w:rPr>
-        <w:t>long</w:t>
-      </w:r>
-      <w:r>
-        <w:rPr>
-          <w:rFonts w:ascii="돋움체" w:eastAsia="돋움체" w:cs="돋움체"/>
-          <w:color w:val="000000"/>
-          <w:kern w:val="0"/>
-          <w:sz w:val="19"/>
-          <w:szCs w:val="19"/>
-        </w:rPr>
-        <w:t xml:space="preserve"> </w:t>
+        <w:t>double</w:t>
+      </w:r>
+      <w:r>
+        <w:rPr>
+          <w:rFonts w:ascii="돋움체" w:eastAsia="돋움체" w:cs="돋움체"/>
+          <w:color w:val="000000"/>
+          <w:kern w:val="0"/>
+          <w:sz w:val="19"/>
+          <w:szCs w:val="19"/>
+        </w:rPr>
+        <w:t xml:space="preserve">* </w:t>
       </w:r>
       <w:r>
         <w:rPr>
@@ -1228,7 +1259,7 @@
           <w:sz w:val="19"/>
           <w:szCs w:val="19"/>
         </w:rPr>
-        <w:t>NProtectionCurve</w:t>
+        <w:t>PremiumCurve</w:t>
       </w:r>
       <w:r>
         <w:rPr>
@@ -1268,7 +1299,7 @@
           <w:sz w:val="19"/>
           <w:szCs w:val="19"/>
         </w:rPr>
-        <w:t xml:space="preserve">// Protection Leg </w:t>
+        <w:t xml:space="preserve">// Premium Leg </w:t>
       </w:r>
       <w:r>
         <w:rPr>
@@ -1288,17 +1319,7 @@
           <w:sz w:val="19"/>
           <w:szCs w:val="19"/>
         </w:rPr>
-        <w:t xml:space="preserve"> Term </w:t>
-      </w:r>
-      <w:r>
-        <w:rPr>
-          <w:rFonts w:ascii="돋움체" w:eastAsia="돋움체" w:cs="돋움체" w:hint="eastAsia"/>
-          <w:color w:val="008000"/>
-          <w:kern w:val="0"/>
-          <w:sz w:val="19"/>
-          <w:szCs w:val="19"/>
-        </w:rPr>
-        <w:t>개수</w:t>
+        <w:t xml:space="preserve"> Rate Array</w:t>
       </w:r>
     </w:p>
     <w:p>
@@ -1315,96 +1336,6 @@
           <w:szCs w:val="19"/>
         </w:rPr>
       </w:pPr>
-      <w:r>
-        <w:rPr>
-          <w:rFonts w:ascii="돋움체" w:eastAsia="돋움체" w:cs="돋움체"/>
-          <w:color w:val="000000"/>
-          <w:kern w:val="0"/>
-          <w:sz w:val="19"/>
-          <w:szCs w:val="19"/>
-        </w:rPr>
-        <w:tab/>
-      </w:r>
-      <w:r>
-        <w:rPr>
-          <w:rFonts w:ascii="돋움체" w:eastAsia="돋움체" w:cs="돋움체"/>
-          <w:color w:val="0000FF"/>
-          <w:kern w:val="0"/>
-          <w:sz w:val="19"/>
-          <w:szCs w:val="19"/>
-        </w:rPr>
-        <w:t>double</w:t>
-      </w:r>
-      <w:r>
-        <w:rPr>
-          <w:rFonts w:ascii="돋움체" w:eastAsia="돋움체" w:cs="돋움체"/>
-          <w:color w:val="000000"/>
-          <w:kern w:val="0"/>
-          <w:sz w:val="19"/>
-          <w:szCs w:val="19"/>
-        </w:rPr>
-        <w:t xml:space="preserve">* </w:t>
-      </w:r>
-      <w:r>
-        <w:rPr>
-          <w:rFonts w:ascii="돋움체" w:eastAsia="돋움체" w:cs="돋움체"/>
-          <w:color w:val="808080"/>
-          <w:kern w:val="0"/>
-          <w:sz w:val="19"/>
-          <w:szCs w:val="19"/>
-        </w:rPr>
-        <w:t>ProtectionCurveTerm</w:t>
-      </w:r>
-      <w:r>
-        <w:rPr>
-          <w:rFonts w:ascii="돋움체" w:eastAsia="돋움체" w:cs="돋움체"/>
-          <w:color w:val="000000"/>
-          <w:kern w:val="0"/>
-          <w:sz w:val="19"/>
-          <w:szCs w:val="19"/>
-        </w:rPr>
-        <w:t>,</w:t>
-      </w:r>
-      <w:r>
-        <w:rPr>
-          <w:rFonts w:ascii="돋움체" w:eastAsia="돋움체" w:cs="돋움체"/>
-          <w:color w:val="000000"/>
-          <w:kern w:val="0"/>
-          <w:sz w:val="19"/>
-          <w:szCs w:val="19"/>
-        </w:rPr>
-        <w:tab/>
-      </w:r>
-      <w:r>
-        <w:rPr>
-          <w:rFonts w:ascii="돋움체" w:eastAsia="돋움체" w:cs="돋움체"/>
-          <w:color w:val="008000"/>
-          <w:kern w:val="0"/>
-          <w:sz w:val="19"/>
-          <w:szCs w:val="19"/>
-        </w:rPr>
-        <w:t xml:space="preserve">// Protection Leg </w:t>
-      </w:r>
-      <w:r>
-        <w:rPr>
-          <w:rFonts w:ascii="돋움체" w:eastAsia="돋움체" w:cs="돋움체" w:hint="eastAsia"/>
-          <w:color w:val="008000"/>
-          <w:kern w:val="0"/>
-          <w:sz w:val="19"/>
-          <w:szCs w:val="19"/>
-        </w:rPr>
-        <w:t>커브</w:t>
-      </w:r>
-      <w:r>
-        <w:rPr>
-          <w:rFonts w:ascii="돋움체" w:eastAsia="돋움체" w:cs="돋움체"/>
-          <w:color w:val="008000"/>
-          <w:kern w:val="0"/>
-          <w:sz w:val="19"/>
-          <w:szCs w:val="19"/>
-        </w:rPr>
-        <w:t xml:space="preserve"> Term</w:t>
-      </w:r>
     </w:p>
     <w:p>
       <w:pPr>
@@ -1438,17 +1369,17 @@
           <w:sz w:val="19"/>
           <w:szCs w:val="19"/>
         </w:rPr>
-        <w:t>double</w:t>
-      </w:r>
-      <w:r>
-        <w:rPr>
-          <w:rFonts w:ascii="돋움체" w:eastAsia="돋움체" w:cs="돋움체"/>
-          <w:color w:val="000000"/>
-          <w:kern w:val="0"/>
-          <w:sz w:val="19"/>
-          <w:szCs w:val="19"/>
-        </w:rPr>
-        <w:t xml:space="preserve">* </w:t>
+        <w:t>long</w:t>
+      </w:r>
+      <w:r>
+        <w:rPr>
+          <w:rFonts w:ascii="돋움체" w:eastAsia="돋움체" w:cs="돋움체"/>
+          <w:color w:val="000000"/>
+          <w:kern w:val="0"/>
+          <w:sz w:val="19"/>
+          <w:szCs w:val="19"/>
+        </w:rPr>
+        <w:t xml:space="preserve"> </w:t>
       </w:r>
       <w:r>
         <w:rPr>
@@ -1458,7 +1389,7 @@
           <w:sz w:val="19"/>
           <w:szCs w:val="19"/>
         </w:rPr>
-        <w:t>ProtectionCurve</w:t>
+        <w:t>NProtectionCurve</w:t>
       </w:r>
       <w:r>
         <w:rPr>
@@ -1518,7 +1449,17 @@
           <w:sz w:val="19"/>
           <w:szCs w:val="19"/>
         </w:rPr>
-        <w:t xml:space="preserve"> Rate Array</w:t>
+        <w:t xml:space="preserve"> Term </w:t>
+      </w:r>
+      <w:r>
+        <w:rPr>
+          <w:rFonts w:ascii="돋움체" w:eastAsia="돋움체" w:cs="돋움체" w:hint="eastAsia"/>
+          <w:color w:val="008000"/>
+          <w:kern w:val="0"/>
+          <w:sz w:val="19"/>
+          <w:szCs w:val="19"/>
+        </w:rPr>
+        <w:t>개수</w:t>
       </w:r>
     </w:p>
     <w:p>
@@ -1535,6 +1476,96 @@
           <w:szCs w:val="19"/>
         </w:rPr>
       </w:pPr>
+      <w:r>
+        <w:rPr>
+          <w:rFonts w:ascii="돋움체" w:eastAsia="돋움체" w:cs="돋움체"/>
+          <w:color w:val="000000"/>
+          <w:kern w:val="0"/>
+          <w:sz w:val="19"/>
+          <w:szCs w:val="19"/>
+        </w:rPr>
+        <w:tab/>
+      </w:r>
+      <w:r>
+        <w:rPr>
+          <w:rFonts w:ascii="돋움체" w:eastAsia="돋움체" w:cs="돋움체"/>
+          <w:color w:val="0000FF"/>
+          <w:kern w:val="0"/>
+          <w:sz w:val="19"/>
+          <w:szCs w:val="19"/>
+        </w:rPr>
+        <w:t>double</w:t>
+      </w:r>
+      <w:r>
+        <w:rPr>
+          <w:rFonts w:ascii="돋움체" w:eastAsia="돋움체" w:cs="돋움체"/>
+          <w:color w:val="000000"/>
+          <w:kern w:val="0"/>
+          <w:sz w:val="19"/>
+          <w:szCs w:val="19"/>
+        </w:rPr>
+        <w:t xml:space="preserve">* </w:t>
+      </w:r>
+      <w:r>
+        <w:rPr>
+          <w:rFonts w:ascii="돋움체" w:eastAsia="돋움체" w:cs="돋움체"/>
+          <w:color w:val="808080"/>
+          <w:kern w:val="0"/>
+          <w:sz w:val="19"/>
+          <w:szCs w:val="19"/>
+        </w:rPr>
+        <w:t>ProtectionCurveTerm</w:t>
+      </w:r>
+      <w:r>
+        <w:rPr>
+          <w:rFonts w:ascii="돋움체" w:eastAsia="돋움체" w:cs="돋움체"/>
+          <w:color w:val="000000"/>
+          <w:kern w:val="0"/>
+          <w:sz w:val="19"/>
+          <w:szCs w:val="19"/>
+        </w:rPr>
+        <w:t>,</w:t>
+      </w:r>
+      <w:r>
+        <w:rPr>
+          <w:rFonts w:ascii="돋움체" w:eastAsia="돋움체" w:cs="돋움체"/>
+          <w:color w:val="000000"/>
+          <w:kern w:val="0"/>
+          <w:sz w:val="19"/>
+          <w:szCs w:val="19"/>
+        </w:rPr>
+        <w:tab/>
+      </w:r>
+      <w:r>
+        <w:rPr>
+          <w:rFonts w:ascii="돋움체" w:eastAsia="돋움체" w:cs="돋움체"/>
+          <w:color w:val="008000"/>
+          <w:kern w:val="0"/>
+          <w:sz w:val="19"/>
+          <w:szCs w:val="19"/>
+        </w:rPr>
+        <w:t xml:space="preserve">// Protection Leg </w:t>
+      </w:r>
+      <w:r>
+        <w:rPr>
+          <w:rFonts w:ascii="돋움체" w:eastAsia="돋움체" w:cs="돋움체" w:hint="eastAsia"/>
+          <w:color w:val="008000"/>
+          <w:kern w:val="0"/>
+          <w:sz w:val="19"/>
+          <w:szCs w:val="19"/>
+        </w:rPr>
+        <w:t>커브</w:t>
+      </w:r>
+      <w:r>
+        <w:rPr>
+          <w:rFonts w:ascii="돋움체" w:eastAsia="돋움체" w:cs="돋움체"/>
+          <w:color w:val="008000"/>
+          <w:kern w:val="0"/>
+          <w:sz w:val="19"/>
+          <w:szCs w:val="19"/>
+        </w:rPr>
+        <w:t xml:space="preserve"> Term</w:t>
+      </w:r>
     </w:p>
     <w:p>
       <w:pPr>
@@ -1568,17 +1599,17 @@
           <w:sz w:val="19"/>
           <w:szCs w:val="19"/>
         </w:rPr>
-        <w:t>long</w:t>
-      </w:r>
-      <w:r>
-        <w:rPr>
-          <w:rFonts w:ascii="돋움체" w:eastAsia="돋움체" w:cs="돋움체"/>
-          <w:color w:val="000000"/>
-          <w:kern w:val="0"/>
-          <w:sz w:val="19"/>
-          <w:szCs w:val="19"/>
-        </w:rPr>
-        <w:t xml:space="preserve"> </w:t>
+        <w:t>double</w:t>
+      </w:r>
+      <w:r>
+        <w:rPr>
+          <w:rFonts w:ascii="돋움체" w:eastAsia="돋움체" w:cs="돋움체"/>
+          <w:color w:val="000000"/>
+          <w:kern w:val="0"/>
+          <w:sz w:val="19"/>
+          <w:szCs w:val="19"/>
+        </w:rPr>
+        <w:t xml:space="preserve">* </w:t>
       </w:r>
       <w:r>
         <w:rPr>
@@ -1588,7 +1619,7 @@
           <w:sz w:val="19"/>
           <w:szCs w:val="19"/>
         </w:rPr>
-        <w:t>NCDSCurve</w:t>
+        <w:t>ProtectionCurve</w:t>
       </w:r>
       <w:r>
         <w:rPr>
@@ -1623,32 +1654,32 @@
       <w:r>
         <w:rPr>
           <w:rFonts w:ascii="돋움체" w:eastAsia="돋움체" w:cs="돋움체"/>
-          <w:color w:val="000000"/>
-          <w:kern w:val="0"/>
-          <w:sz w:val="19"/>
-          <w:szCs w:val="19"/>
-        </w:rPr>
-        <w:tab/>
-      </w:r>
-      <w:r>
-        <w:rPr>
-          <w:rFonts w:ascii="돋움체" w:eastAsia="돋움체" w:cs="돋움체"/>
-          <w:color w:val="008000"/>
-          <w:kern w:val="0"/>
-          <w:sz w:val="19"/>
-          <w:szCs w:val="19"/>
-        </w:rPr>
-        <w:t xml:space="preserve">// CDS Term </w:t>
-      </w:r>
-      <w:r>
-        <w:rPr>
-          <w:rFonts w:ascii="돋움체" w:eastAsia="돋움체" w:cs="돋움체" w:hint="eastAsia"/>
-          <w:color w:val="008000"/>
-          <w:kern w:val="0"/>
-          <w:sz w:val="19"/>
-          <w:szCs w:val="19"/>
-        </w:rPr>
-        <w:t>개수</w:t>
+          <w:color w:val="008000"/>
+          <w:kern w:val="0"/>
+          <w:sz w:val="19"/>
+          <w:szCs w:val="19"/>
+        </w:rPr>
+        <w:t xml:space="preserve">// Protection Leg </w:t>
+      </w:r>
+      <w:r>
+        <w:rPr>
+          <w:rFonts w:ascii="돋움체" w:eastAsia="돋움체" w:cs="돋움체" w:hint="eastAsia"/>
+          <w:color w:val="008000"/>
+          <w:kern w:val="0"/>
+          <w:sz w:val="19"/>
+          <w:szCs w:val="19"/>
+        </w:rPr>
+        <w:t>커브</w:t>
+      </w:r>
+      <w:r>
+        <w:rPr>
+          <w:rFonts w:ascii="돋움체" w:eastAsia="돋움체" w:cs="돋움체"/>
+          <w:color w:val="008000"/>
+          <w:kern w:val="0"/>
+          <w:sz w:val="19"/>
+          <w:szCs w:val="19"/>
+        </w:rPr>
+        <w:t xml:space="preserve"> Rate Array</w:t>
       </w:r>
     </w:p>
     <w:p>
@@ -1665,86 +1696,6 @@
           <w:szCs w:val="19"/>
         </w:rPr>
       </w:pPr>
-      <w:r>
-        <w:rPr>
-          <w:rFonts w:ascii="돋움체" w:eastAsia="돋움체" w:cs="돋움체"/>
-          <w:color w:val="000000"/>
-          <w:kern w:val="0"/>
-          <w:sz w:val="19"/>
-          <w:szCs w:val="19"/>
-        </w:rPr>
-        <w:tab/>
-      </w:r>
-      <w:r>
-        <w:rPr>
-          <w:rFonts w:ascii="돋움체" w:eastAsia="돋움체" w:cs="돋움체"/>
-          <w:color w:val="0000FF"/>
-          <w:kern w:val="0"/>
-          <w:sz w:val="19"/>
-          <w:szCs w:val="19"/>
-        </w:rPr>
-        <w:t>double</w:t>
-      </w:r>
-      <w:r>
-        <w:rPr>
-          <w:rFonts w:ascii="돋움체" w:eastAsia="돋움체" w:cs="돋움체"/>
-          <w:color w:val="000000"/>
-          <w:kern w:val="0"/>
-          <w:sz w:val="19"/>
-          <w:szCs w:val="19"/>
-        </w:rPr>
-        <w:t xml:space="preserve">* </w:t>
-      </w:r>
-      <w:r>
-        <w:rPr>
-          <w:rFonts w:ascii="돋움체" w:eastAsia="돋움체" w:cs="돋움체"/>
-          <w:color w:val="808080"/>
-          <w:kern w:val="0"/>
-          <w:sz w:val="19"/>
-          <w:szCs w:val="19"/>
-        </w:rPr>
-        <w:t>CDSCurveTerm</w:t>
-      </w:r>
-      <w:r>
-        <w:rPr>
-          <w:rFonts w:ascii="돋움체" w:eastAsia="돋움체" w:cs="돋움체"/>
-          <w:color w:val="000000"/>
-          <w:kern w:val="0"/>
-          <w:sz w:val="19"/>
-          <w:szCs w:val="19"/>
-        </w:rPr>
-        <w:t>,</w:t>
-      </w:r>
-      <w:r>
-        <w:rPr>
-          <w:rFonts w:ascii="돋움체" w:eastAsia="돋움체" w:cs="돋움체"/>
-          <w:color w:val="000000"/>
-          <w:kern w:val="0"/>
-          <w:sz w:val="19"/>
-          <w:szCs w:val="19"/>
-        </w:rPr>
-        <w:tab/>
-      </w:r>
-      <w:r>
-        <w:rPr>
-          <w:rFonts w:ascii="돋움체" w:eastAsia="돋움체" w:cs="돋움체"/>
-          <w:color w:val="000000"/>
-          <w:kern w:val="0"/>
-          <w:sz w:val="19"/>
-          <w:szCs w:val="19"/>
-        </w:rPr>
-        <w:tab/>
-      </w:r>
-      <w:r>
-        <w:rPr>
-          <w:rFonts w:ascii="돋움체" w:eastAsia="돋움체" w:cs="돋움체"/>
-          <w:color w:val="008000"/>
-          <w:kern w:val="0"/>
-          <w:sz w:val="19"/>
-          <w:szCs w:val="19"/>
-        </w:rPr>
-        <w:t>// CDS Term Array</w:t>
-      </w:r>
     </w:p>
     <w:p>
       <w:pPr>
@@ -1778,17 +1729,17 @@
           <w:sz w:val="19"/>
           <w:szCs w:val="19"/>
         </w:rPr>
-        <w:t>double</w:t>
-      </w:r>
-      <w:r>
-        <w:rPr>
-          <w:rFonts w:ascii="돋움체" w:eastAsia="돋움체" w:cs="돋움체"/>
-          <w:color w:val="000000"/>
-          <w:kern w:val="0"/>
-          <w:sz w:val="19"/>
-          <w:szCs w:val="19"/>
-        </w:rPr>
-        <w:t xml:space="preserve">* </w:t>
+        <w:t>long</w:t>
+      </w:r>
+      <w:r>
+        <w:rPr>
+          <w:rFonts w:ascii="돋움체" w:eastAsia="돋움체" w:cs="돋움체"/>
+          <w:color w:val="000000"/>
+          <w:kern w:val="0"/>
+          <w:sz w:val="19"/>
+          <w:szCs w:val="19"/>
+        </w:rPr>
+        <w:t xml:space="preserve"> </w:t>
       </w:r>
       <w:r>
         <w:rPr>
@@ -1798,7 +1749,7 @@
           <w:sz w:val="19"/>
           <w:szCs w:val="19"/>
         </w:rPr>
-        <w:t>CDSCurve</w:t>
+        <w:t>NCDSCurve</w:t>
       </w:r>
       <w:r>
         <w:rPr>
@@ -1833,12 +1784,32 @@
       <w:r>
         <w:rPr>
           <w:rFonts w:ascii="돋움체" w:eastAsia="돋움체" w:cs="돋움체"/>
-          <w:color w:val="008000"/>
-          <w:kern w:val="0"/>
-          <w:sz w:val="19"/>
-          <w:szCs w:val="19"/>
-        </w:rPr>
-        <w:t>// CDS Spread Array</w:t>
+          <w:color w:val="000000"/>
+          <w:kern w:val="0"/>
+          <w:sz w:val="19"/>
+          <w:szCs w:val="19"/>
+        </w:rPr>
+        <w:tab/>
+      </w:r>
+      <w:r>
+        <w:rPr>
+          <w:rFonts w:ascii="돋움체" w:eastAsia="돋움체" w:cs="돋움체"/>
+          <w:color w:val="008000"/>
+          <w:kern w:val="0"/>
+          <w:sz w:val="19"/>
+          <w:szCs w:val="19"/>
+        </w:rPr>
+        <w:t xml:space="preserve">// CDS Term </w:t>
+      </w:r>
+      <w:r>
+        <w:rPr>
+          <w:rFonts w:ascii="돋움체" w:eastAsia="돋움체" w:cs="돋움체" w:hint="eastAsia"/>
+          <w:color w:val="008000"/>
+          <w:kern w:val="0"/>
+          <w:sz w:val="19"/>
+          <w:szCs w:val="19"/>
+        </w:rPr>
+        <w:t>개수</w:t>
       </w:r>
     </w:p>
     <w:p>
@@ -1855,6 +1826,86 @@
           <w:szCs w:val="19"/>
         </w:rPr>
       </w:pPr>
+      <w:r>
+        <w:rPr>
+          <w:rFonts w:ascii="돋움체" w:eastAsia="돋움체" w:cs="돋움체"/>
+          <w:color w:val="000000"/>
+          <w:kern w:val="0"/>
+          <w:sz w:val="19"/>
+          <w:szCs w:val="19"/>
+        </w:rPr>
+        <w:tab/>
+      </w:r>
+      <w:r>
+        <w:rPr>
+          <w:rFonts w:ascii="돋움체" w:eastAsia="돋움체" w:cs="돋움체"/>
+          <w:color w:val="0000FF"/>
+          <w:kern w:val="0"/>
+          <w:sz w:val="19"/>
+          <w:szCs w:val="19"/>
+        </w:rPr>
+        <w:t>double</w:t>
+      </w:r>
+      <w:r>
+        <w:rPr>
+          <w:rFonts w:ascii="돋움체" w:eastAsia="돋움체" w:cs="돋움체"/>
+          <w:color w:val="000000"/>
+          <w:kern w:val="0"/>
+          <w:sz w:val="19"/>
+          <w:szCs w:val="19"/>
+        </w:rPr>
+        <w:t xml:space="preserve">* </w:t>
+      </w:r>
+      <w:r>
+        <w:rPr>
+          <w:rFonts w:ascii="돋움체" w:eastAsia="돋움체" w:cs="돋움체"/>
+          <w:color w:val="808080"/>
+          <w:kern w:val="0"/>
+          <w:sz w:val="19"/>
+          <w:szCs w:val="19"/>
+        </w:rPr>
+        <w:t>CDSCurveTerm</w:t>
+      </w:r>
+      <w:r>
+        <w:rPr>
+          <w:rFonts w:ascii="돋움체" w:eastAsia="돋움체" w:cs="돋움체"/>
+          <w:color w:val="000000"/>
+          <w:kern w:val="0"/>
+          <w:sz w:val="19"/>
+          <w:szCs w:val="19"/>
+        </w:rPr>
+        <w:t>,</w:t>
+      </w:r>
+      <w:r>
+        <w:rPr>
+          <w:rFonts w:ascii="돋움체" w:eastAsia="돋움체" w:cs="돋움체"/>
+          <w:color w:val="000000"/>
+          <w:kern w:val="0"/>
+          <w:sz w:val="19"/>
+          <w:szCs w:val="19"/>
+        </w:rPr>
+        <w:tab/>
+      </w:r>
+      <w:r>
+        <w:rPr>
+          <w:rFonts w:ascii="돋움체" w:eastAsia="돋움체" w:cs="돋움체"/>
+          <w:color w:val="000000"/>
+          <w:kern w:val="0"/>
+          <w:sz w:val="19"/>
+          <w:szCs w:val="19"/>
+        </w:rPr>
+        <w:tab/>
+      </w:r>
+      <w:r>
+        <w:rPr>
+          <w:rFonts w:ascii="돋움체" w:eastAsia="돋움체" w:cs="돋움체"/>
+          <w:color w:val="008000"/>
+          <w:kern w:val="0"/>
+          <w:sz w:val="19"/>
+          <w:szCs w:val="19"/>
+        </w:rPr>
+        <w:t>// CDS Term Array</w:t>
+      </w:r>
     </w:p>
     <w:p>
       <w:pPr>
@@ -1898,7 +1949,7 @@
           <w:sz w:val="19"/>
           <w:szCs w:val="19"/>
         </w:rPr>
-        <w:t xml:space="preserve"> </w:t>
+        <w:t xml:space="preserve">* </w:t>
       </w:r>
       <w:r>
         <w:rPr>
@@ -1908,7 +1959,7 @@
           <w:sz w:val="19"/>
           <w:szCs w:val="19"/>
         </w:rPr>
-        <w:t>Recovery</w:t>
+        <w:t>CDSCurve</w:t>
       </w:r>
       <w:r>
         <w:rPr>
@@ -1943,22 +1994,12 @@
       <w:r>
         <w:rPr>
           <w:rFonts w:ascii="돋움체" w:eastAsia="돋움체" w:cs="돋움체"/>
-          <w:color w:val="000000"/>
-          <w:kern w:val="0"/>
-          <w:sz w:val="19"/>
-          <w:szCs w:val="19"/>
-        </w:rPr>
-        <w:tab/>
-      </w:r>
-      <w:r>
-        <w:rPr>
-          <w:rFonts w:ascii="돋움체" w:eastAsia="돋움체" w:cs="돋움체"/>
-          <w:color w:val="008000"/>
-          <w:kern w:val="0"/>
-          <w:sz w:val="19"/>
-          <w:szCs w:val="19"/>
-        </w:rPr>
-        <w:t>// Recovery Rate</w:t>
+          <w:color w:val="008000"/>
+          <w:kern w:val="0"/>
+          <w:sz w:val="19"/>
+          <w:szCs w:val="19"/>
+        </w:rPr>
+        <w:t>// CDS Spread Array</w:t>
       </w:r>
     </w:p>
     <w:p>
@@ -1975,116 +2016,6 @@
           <w:szCs w:val="19"/>
         </w:rPr>
       </w:pPr>
-      <w:r>
-        <w:rPr>
-          <w:rFonts w:ascii="돋움체" w:eastAsia="돋움체" w:cs="돋움체"/>
-          <w:color w:val="000000"/>
-          <w:kern w:val="0"/>
-          <w:sz w:val="19"/>
-          <w:szCs w:val="19"/>
-        </w:rPr>
-        <w:tab/>
-      </w:r>
-      <w:r>
-        <w:rPr>
-          <w:rFonts w:ascii="돋움체" w:eastAsia="돋움체" w:cs="돋움체"/>
-          <w:color w:val="0000FF"/>
-          <w:kern w:val="0"/>
-          <w:sz w:val="19"/>
-          <w:szCs w:val="19"/>
-        </w:rPr>
-        <w:t>long</w:t>
-      </w:r>
-      <w:r>
-        <w:rPr>
-          <w:rFonts w:ascii="돋움체" w:eastAsia="돋움체" w:cs="돋움체"/>
-          <w:color w:val="000000"/>
-          <w:kern w:val="0"/>
-          <w:sz w:val="19"/>
-          <w:szCs w:val="19"/>
-        </w:rPr>
-        <w:t xml:space="preserve"> </w:t>
-      </w:r>
-      <w:r>
-        <w:rPr>
-          <w:rFonts w:ascii="돋움체" w:eastAsia="돋움체" w:cs="돋움체"/>
-          <w:color w:val="808080"/>
-          <w:kern w:val="0"/>
-          <w:sz w:val="19"/>
-          <w:szCs w:val="19"/>
-        </w:rPr>
-        <w:t>HazardRateCalcFlag</w:t>
-      </w:r>
-      <w:r>
-        <w:rPr>
-          <w:rFonts w:ascii="돋움체" w:eastAsia="돋움체" w:cs="돋움체"/>
-          <w:color w:val="000000"/>
-          <w:kern w:val="0"/>
-          <w:sz w:val="19"/>
-          <w:szCs w:val="19"/>
-        </w:rPr>
-        <w:t>,</w:t>
-      </w:r>
-      <w:r>
-        <w:rPr>
-          <w:rFonts w:ascii="돋움체" w:eastAsia="돋움체" w:cs="돋움체"/>
-          <w:color w:val="000000"/>
-          <w:kern w:val="0"/>
-          <w:sz w:val="19"/>
-          <w:szCs w:val="19"/>
-        </w:rPr>
-        <w:tab/>
-      </w:r>
-      <w:r>
-        <w:rPr>
-          <w:rFonts w:ascii="돋움체" w:eastAsia="돋움체" w:cs="돋움체"/>
-          <w:color w:val="000000"/>
-          <w:kern w:val="0"/>
-          <w:sz w:val="19"/>
-          <w:szCs w:val="19"/>
-        </w:rPr>
-        <w:tab/>
-      </w:r>
-      <w:r>
-        <w:rPr>
-          <w:rFonts w:ascii="돋움체" w:eastAsia="돋움체" w:cs="돋움체"/>
-          <w:color w:val="008000"/>
-          <w:kern w:val="0"/>
-          <w:sz w:val="19"/>
-          <w:szCs w:val="19"/>
-        </w:rPr>
-        <w:t xml:space="preserve">// Hazard Rate Calc </w:t>
-      </w:r>
-      <w:r>
-        <w:rPr>
-          <w:rFonts w:ascii="돋움체" w:eastAsia="돋움체" w:cs="돋움체" w:hint="eastAsia"/>
-          <w:color w:val="008000"/>
-          <w:kern w:val="0"/>
-          <w:sz w:val="19"/>
-          <w:szCs w:val="19"/>
-        </w:rPr>
-        <w:t>방법</w:t>
-      </w:r>
-      <w:r>
-        <w:rPr>
-          <w:rFonts w:ascii="돋움체" w:eastAsia="돋움체" w:cs="돋움체"/>
-          <w:color w:val="008000"/>
-          <w:kern w:val="0"/>
-          <w:sz w:val="19"/>
-          <w:szCs w:val="19"/>
-        </w:rPr>
-        <w:t xml:space="preserve"> 0: Continuous 1: </w:t>
-      </w:r>
-      <w:r>
-        <w:rPr>
-          <w:rFonts w:ascii="돋움체" w:eastAsia="돋움체" w:cs="돋움체" w:hint="eastAsia"/>
-          <w:color w:val="008000"/>
-          <w:kern w:val="0"/>
-          <w:sz w:val="19"/>
-          <w:szCs w:val="19"/>
-        </w:rPr>
-        <w:t>단리</w:t>
-      </w:r>
     </w:p>
     <w:p>
       <w:pPr>
@@ -2118,7 +2049,7 @@
           <w:sz w:val="19"/>
           <w:szCs w:val="19"/>
         </w:rPr>
-        <w:t>long</w:t>
+        <w:t>double</w:t>
       </w:r>
       <w:r>
         <w:rPr>
@@ -2138,7 +2069,7 @@
           <w:sz w:val="19"/>
           <w:szCs w:val="19"/>
         </w:rPr>
-        <w:t>NCPN_Ann</w:t>
+        <w:t>Recovery</w:t>
       </w:r>
       <w:r>
         <w:rPr>
@@ -2188,87 +2119,7 @@
           <w:sz w:val="19"/>
           <w:szCs w:val="19"/>
         </w:rPr>
-        <w:t xml:space="preserve">// </w:t>
-      </w:r>
-      <w:r>
-        <w:rPr>
-          <w:rFonts w:ascii="돋움체" w:eastAsia="돋움체" w:cs="돋움체" w:hint="eastAsia"/>
-          <w:color w:val="008000"/>
-          <w:kern w:val="0"/>
-          <w:sz w:val="19"/>
-          <w:szCs w:val="19"/>
-        </w:rPr>
-        <w:t>연</w:t>
-      </w:r>
-      <w:r>
-        <w:rPr>
-          <w:rFonts w:ascii="돋움체" w:eastAsia="돋움체" w:cs="돋움체"/>
-          <w:color w:val="008000"/>
-          <w:kern w:val="0"/>
-          <w:sz w:val="19"/>
-          <w:szCs w:val="19"/>
-        </w:rPr>
-        <w:t xml:space="preserve"> </w:t>
-      </w:r>
-      <w:r>
-        <w:rPr>
-          <w:rFonts w:ascii="돋움체" w:eastAsia="돋움체" w:cs="돋움체" w:hint="eastAsia"/>
-          <w:color w:val="008000"/>
-          <w:kern w:val="0"/>
-          <w:sz w:val="19"/>
-          <w:szCs w:val="19"/>
-        </w:rPr>
-        <w:t>이자지급</w:t>
-      </w:r>
-      <w:r>
-        <w:rPr>
-          <w:rFonts w:ascii="돋움체" w:eastAsia="돋움체" w:cs="돋움체"/>
-          <w:color w:val="008000"/>
-          <w:kern w:val="0"/>
-          <w:sz w:val="19"/>
-          <w:szCs w:val="19"/>
-        </w:rPr>
-        <w:t xml:space="preserve"> </w:t>
-      </w:r>
-      <w:r>
-        <w:rPr>
-          <w:rFonts w:ascii="돋움체" w:eastAsia="돋움체" w:cs="돋움체" w:hint="eastAsia"/>
-          <w:color w:val="008000"/>
-          <w:kern w:val="0"/>
-          <w:sz w:val="19"/>
-          <w:szCs w:val="19"/>
-        </w:rPr>
-        <w:t>수</w:t>
-      </w:r>
-      <w:r>
-        <w:rPr>
-          <w:rFonts w:ascii="돋움체" w:eastAsia="돋움체" w:cs="돋움체"/>
-          <w:color w:val="008000"/>
-          <w:kern w:val="0"/>
-          <w:sz w:val="19"/>
-          <w:szCs w:val="19"/>
-        </w:rPr>
-        <w:tab/>
-      </w:r>
-      <w:r>
-        <w:rPr>
-          <w:rFonts w:ascii="돋움체" w:eastAsia="돋움체" w:cs="돋움체"/>
-          <w:color w:val="008000"/>
-          <w:kern w:val="0"/>
-          <w:sz w:val="19"/>
-          <w:szCs w:val="19"/>
-        </w:rPr>
-        <w:tab/>
-      </w:r>
-      <w:r>
-        <w:rPr>
-          <w:rFonts w:ascii="돋움체" w:eastAsia="돋움체" w:cs="돋움체"/>
-          <w:color w:val="008000"/>
-          <w:kern w:val="0"/>
-          <w:sz w:val="19"/>
-          <w:szCs w:val="19"/>
-        </w:rPr>
-        <w:tab/>
+        <w:t>// Recovery Rate</w:t>
       </w:r>
     </w:p>
     <w:p>
@@ -2278,13 +2129,205 @@
         <w:spacing w:after="0" w:line="240" w:lineRule="auto"/>
         <w:jc w:val="left"/>
         <w:rPr>
-          <w:rFonts w:ascii="돋움체" w:eastAsia="돋움체" w:cs="돋움체"/>
-          <w:color w:val="000000"/>
-          <w:kern w:val="0"/>
-          <w:sz w:val="19"/>
-          <w:szCs w:val="19"/>
-        </w:rPr>
-      </w:pPr>
+          <w:rFonts w:ascii="돋움체" w:eastAsia="돋움체" w:cs="돋움체" w:hint="eastAsia"/>
+          <w:color w:val="008000"/>
+          <w:kern w:val="0"/>
+          <w:sz w:val="19"/>
+          <w:szCs w:val="19"/>
+        </w:rPr>
+      </w:pPr>
+      <w:r>
+        <w:rPr>
+          <w:rFonts w:ascii="돋움체" w:eastAsia="돋움체" w:cs="돋움체"/>
+          <w:color w:val="000000"/>
+          <w:kern w:val="0"/>
+          <w:sz w:val="19"/>
+          <w:szCs w:val="19"/>
+        </w:rPr>
+        <w:tab/>
+      </w:r>
+      <w:r>
+        <w:rPr>
+          <w:rFonts w:ascii="돋움체" w:eastAsia="돋움체" w:cs="돋움체"/>
+          <w:color w:val="0000FF"/>
+          <w:kern w:val="0"/>
+          <w:sz w:val="19"/>
+          <w:szCs w:val="19"/>
+        </w:rPr>
+        <w:t>long</w:t>
+      </w:r>
+      <w:r>
+        <w:rPr>
+          <w:rFonts w:ascii="돋움체" w:eastAsia="돋움체" w:cs="돋움체"/>
+          <w:color w:val="000000"/>
+          <w:kern w:val="0"/>
+          <w:sz w:val="19"/>
+          <w:szCs w:val="19"/>
+        </w:rPr>
+        <w:t xml:space="preserve"> </w:t>
+      </w:r>
+      <w:r>
+        <w:rPr>
+          <w:rFonts w:ascii="돋움체" w:eastAsia="돋움체" w:cs="돋움체"/>
+          <w:color w:val="808080"/>
+          <w:kern w:val="0"/>
+          <w:sz w:val="19"/>
+          <w:szCs w:val="19"/>
+        </w:rPr>
+        <w:t>HazardRateCalcFlag</w:t>
+      </w:r>
+      <w:r>
+        <w:rPr>
+          <w:rFonts w:ascii="돋움체" w:eastAsia="돋움체" w:cs="돋움체"/>
+          <w:color w:val="000000"/>
+          <w:kern w:val="0"/>
+          <w:sz w:val="19"/>
+          <w:szCs w:val="19"/>
+        </w:rPr>
+        <w:t>,</w:t>
+      </w:r>
+      <w:r>
+        <w:rPr>
+          <w:rFonts w:ascii="돋움체" w:eastAsia="돋움체" w:cs="돋움체"/>
+          <w:color w:val="000000"/>
+          <w:kern w:val="0"/>
+          <w:sz w:val="19"/>
+          <w:szCs w:val="19"/>
+        </w:rPr>
+        <w:tab/>
+      </w:r>
+      <w:r>
+        <w:rPr>
+          <w:rFonts w:ascii="돋움체" w:eastAsia="돋움체" w:cs="돋움체"/>
+          <w:color w:val="000000"/>
+          <w:kern w:val="0"/>
+          <w:sz w:val="19"/>
+          <w:szCs w:val="19"/>
+        </w:rPr>
+        <w:tab/>
+      </w:r>
+      <w:r>
+        <w:rPr>
+          <w:rFonts w:ascii="돋움체" w:eastAsia="돋움체" w:cs="돋움체"/>
+          <w:color w:val="008000"/>
+          <w:kern w:val="0"/>
+          <w:sz w:val="19"/>
+          <w:szCs w:val="19"/>
+        </w:rPr>
+        <w:t xml:space="preserve">// Hazard Rate Calc </w:t>
+      </w:r>
+      <w:r>
+        <w:rPr>
+          <w:rFonts w:ascii="돋움체" w:eastAsia="돋움체" w:cs="돋움체" w:hint="eastAsia"/>
+          <w:color w:val="008000"/>
+          <w:kern w:val="0"/>
+          <w:sz w:val="19"/>
+          <w:szCs w:val="19"/>
+        </w:rPr>
+        <w:t>Flag</w:t>
+      </w:r>
+    </w:p>
+    <w:p>
+      <w:pPr>
+        <w:wordWrap/>
+        <w:adjustRightInd w:val="0"/>
+        <w:spacing w:after="0" w:line="240" w:lineRule="auto"/>
+        <w:ind w:left="3200" w:firstLine="800"/>
+        <w:jc w:val="left"/>
+        <w:rPr>
+          <w:rFonts w:ascii="돋움체" w:eastAsia="돋움체" w:cs="돋움체"/>
+          <w:color w:val="008000"/>
+          <w:kern w:val="0"/>
+          <w:sz w:val="19"/>
+          <w:szCs w:val="19"/>
+        </w:rPr>
+      </w:pPr>
+      <w:r>
+        <w:rPr>
+          <w:rFonts w:ascii="돋움체" w:eastAsia="돋움체" w:cs="돋움체"/>
+          <w:color w:val="008000"/>
+          <w:kern w:val="0"/>
+          <w:sz w:val="19"/>
+          <w:szCs w:val="19"/>
+        </w:rPr>
+        <w:t xml:space="preserve">// </w:t>
+      </w:r>
+      <w:r>
+        <w:rPr>
+          <w:rFonts w:ascii="돋움체" w:eastAsia="돋움체" w:cs="돋움체"/>
+          <w:color w:val="008000"/>
+          <w:kern w:val="0"/>
+          <w:sz w:val="19"/>
+          <w:szCs w:val="19"/>
+        </w:rPr>
+        <w:t xml:space="preserve">0: Continuous Annual Hazard Rate </w:t>
+      </w:r>
+    </w:p>
+    <w:p>
+      <w:pPr>
+        <w:wordWrap/>
+        <w:adjustRightInd w:val="0"/>
+        <w:spacing w:after="0" w:line="240" w:lineRule="auto"/>
+        <w:ind w:left="3200" w:firstLine="800"/>
+        <w:jc w:val="left"/>
+        <w:rPr>
+          <w:rFonts w:ascii="돋움체" w:eastAsia="돋움체" w:cs="돋움체"/>
+          <w:color w:val="000000"/>
+          <w:kern w:val="0"/>
+          <w:sz w:val="19"/>
+          <w:szCs w:val="19"/>
+        </w:rPr>
+      </w:pPr>
+      <w:r>
+        <w:rPr>
+          <w:rFonts w:ascii="돋움체" w:eastAsia="돋움체" w:cs="돋움체"/>
+          <w:color w:val="008000"/>
+          <w:kern w:val="0"/>
+          <w:sz w:val="19"/>
+          <w:szCs w:val="19"/>
+        </w:rPr>
+        <w:t xml:space="preserve">// </w:t>
+      </w:r>
+      <w:r>
+        <w:rPr>
+          <w:rFonts w:ascii="돋움체" w:eastAsia="돋움체" w:cs="돋움체"/>
+          <w:color w:val="008000"/>
+          <w:kern w:val="0"/>
+          <w:sz w:val="19"/>
+          <w:szCs w:val="19"/>
+        </w:rPr>
+        <w:t xml:space="preserve">1: </w:t>
+      </w:r>
+      <w:r>
+        <w:rPr>
+          <w:rFonts w:ascii="돋움체" w:eastAsia="돋움체" w:cs="돋움체" w:hint="eastAsia"/>
+          <w:color w:val="008000"/>
+          <w:kern w:val="0"/>
+          <w:sz w:val="19"/>
+          <w:szCs w:val="19"/>
+        </w:rPr>
+        <w:t>단리</w:t>
+      </w:r>
+      <w:r>
+        <w:rPr>
+          <w:rFonts w:ascii="돋움체" w:eastAsia="돋움체" w:cs="돋움체"/>
+          <w:color w:val="008000"/>
+          <w:kern w:val="0"/>
+          <w:sz w:val="19"/>
+          <w:szCs w:val="19"/>
+        </w:rPr>
+        <w:t xml:space="preserve"> </w:t>
+      </w:r>
+      <w:r>
+        <w:rPr>
+          <w:rFonts w:ascii="돋움체" w:eastAsia="돋움체" w:cs="돋움체" w:hint="eastAsia"/>
+          <w:color w:val="008000"/>
+          <w:kern w:val="0"/>
+          <w:sz w:val="19"/>
+          <w:szCs w:val="19"/>
+        </w:rPr>
+        <w:t>파산확률</w:t>
+      </w:r>
     </w:p>
     <w:p>
       <w:pPr>
@@ -2318,17 +2361,17 @@
           <w:sz w:val="19"/>
           <w:szCs w:val="19"/>
         </w:rPr>
-        <w:t>double</w:t>
-      </w:r>
-      <w:r>
-        <w:rPr>
-          <w:rFonts w:ascii="돋움체" w:eastAsia="돋움체" w:cs="돋움체"/>
-          <w:color w:val="000000"/>
-          <w:kern w:val="0"/>
-          <w:sz w:val="19"/>
-          <w:szCs w:val="19"/>
-        </w:rPr>
-        <w:t xml:space="preserve">* </w:t>
+        <w:t>long</w:t>
+      </w:r>
+      <w:r>
+        <w:rPr>
+          <w:rFonts w:ascii="돋움체" w:eastAsia="돋움체" w:cs="돋움체"/>
+          <w:color w:val="000000"/>
+          <w:kern w:val="0"/>
+          <w:sz w:val="19"/>
+          <w:szCs w:val="19"/>
+        </w:rPr>
+        <w:t xml:space="preserve"> </w:t>
       </w:r>
       <w:r>
         <w:rPr>
@@ -2338,7 +2381,7 @@
           <w:sz w:val="19"/>
           <w:szCs w:val="19"/>
         </w:rPr>
-        <w:t>ResultHazardTerm</w:t>
+        <w:t>NCPN_Ann</w:t>
       </w:r>
       <w:r>
         <w:rPr>
@@ -2373,12 +2416,102 @@
       <w:r>
         <w:rPr>
           <w:rFonts w:ascii="돋움체" w:eastAsia="돋움체" w:cs="돋움체"/>
-          <w:color w:val="008000"/>
-          <w:kern w:val="0"/>
-          <w:sz w:val="19"/>
-          <w:szCs w:val="19"/>
-        </w:rPr>
-        <w:t>// OutPut Hazard Term</w:t>
+          <w:color w:val="000000"/>
+          <w:kern w:val="0"/>
+          <w:sz w:val="19"/>
+          <w:szCs w:val="19"/>
+        </w:rPr>
+        <w:tab/>
+      </w:r>
+      <w:r>
+        <w:rPr>
+          <w:rFonts w:ascii="돋움체" w:eastAsia="돋움체" w:cs="돋움체"/>
+          <w:color w:val="008000"/>
+          <w:kern w:val="0"/>
+          <w:sz w:val="19"/>
+          <w:szCs w:val="19"/>
+        </w:rPr>
+        <w:t xml:space="preserve">// </w:t>
+      </w:r>
+      <w:r>
+        <w:rPr>
+          <w:rFonts w:ascii="돋움체" w:eastAsia="돋움체" w:cs="돋움체" w:hint="eastAsia"/>
+          <w:color w:val="008000"/>
+          <w:kern w:val="0"/>
+          <w:sz w:val="19"/>
+          <w:szCs w:val="19"/>
+        </w:rPr>
+        <w:t>연</w:t>
+      </w:r>
+      <w:r>
+        <w:rPr>
+          <w:rFonts w:ascii="돋움체" w:eastAsia="돋움체" w:cs="돋움체"/>
+          <w:color w:val="008000"/>
+          <w:kern w:val="0"/>
+          <w:sz w:val="19"/>
+          <w:szCs w:val="19"/>
+        </w:rPr>
+        <w:t xml:space="preserve"> </w:t>
+      </w:r>
+      <w:r>
+        <w:rPr>
+          <w:rFonts w:ascii="돋움체" w:eastAsia="돋움체" w:cs="돋움체" w:hint="eastAsia"/>
+          <w:color w:val="008000"/>
+          <w:kern w:val="0"/>
+          <w:sz w:val="19"/>
+          <w:szCs w:val="19"/>
+        </w:rPr>
+        <w:t>이자지급</w:t>
+      </w:r>
+      <w:r>
+        <w:rPr>
+          <w:rFonts w:ascii="돋움체" w:eastAsia="돋움체" w:cs="돋움체"/>
+          <w:color w:val="008000"/>
+          <w:kern w:val="0"/>
+          <w:sz w:val="19"/>
+          <w:szCs w:val="19"/>
+        </w:rPr>
+        <w:t xml:space="preserve"> </w:t>
+      </w:r>
+      <w:r>
+        <w:rPr>
+          <w:rFonts w:ascii="돋움체" w:eastAsia="돋움체" w:cs="돋움체" w:hint="eastAsia"/>
+          <w:color w:val="008000"/>
+          <w:kern w:val="0"/>
+          <w:sz w:val="19"/>
+          <w:szCs w:val="19"/>
+        </w:rPr>
+        <w:t>수</w:t>
+      </w:r>
+      <w:r>
+        <w:rPr>
+          <w:rFonts w:ascii="돋움체" w:eastAsia="돋움체" w:cs="돋움체"/>
+          <w:color w:val="008000"/>
+          <w:kern w:val="0"/>
+          <w:sz w:val="19"/>
+          <w:szCs w:val="19"/>
+        </w:rPr>
+        <w:tab/>
+      </w:r>
+      <w:r>
+        <w:rPr>
+          <w:rFonts w:ascii="돋움체" w:eastAsia="돋움체" w:cs="돋움체"/>
+          <w:color w:val="008000"/>
+          <w:kern w:val="0"/>
+          <w:sz w:val="19"/>
+          <w:szCs w:val="19"/>
+        </w:rPr>
+        <w:tab/>
+      </w:r>
+      <w:r>
+        <w:rPr>
+          <w:rFonts w:ascii="돋움체" w:eastAsia="돋움체" w:cs="돋움체"/>
+          <w:color w:val="008000"/>
+          <w:kern w:val="0"/>
+          <w:sz w:val="19"/>
+          <w:szCs w:val="19"/>
+        </w:rPr>
+        <w:tab/>
       </w:r>
     </w:p>
     <w:p>
@@ -2395,6 +2528,21 @@
           <w:szCs w:val="19"/>
         </w:rPr>
       </w:pPr>
+    </w:p>
+    <w:p>
+      <w:pPr>
+        <w:wordWrap/>
+        <w:adjustRightInd w:val="0"/>
+        <w:spacing w:after="0" w:line="240" w:lineRule="auto"/>
+        <w:jc w:val="left"/>
+        <w:rPr>
+          <w:rFonts w:ascii="돋움체" w:eastAsia="돋움체" w:cs="돋움체"/>
+          <w:color w:val="000000"/>
+          <w:kern w:val="0"/>
+          <w:sz w:val="19"/>
+          <w:szCs w:val="19"/>
+        </w:rPr>
+      </w:pPr>
       <w:r>
         <w:rPr>
           <w:rFonts w:ascii="돋움체" w:eastAsia="돋움체" w:cs="돋움체"/>
@@ -2413,6 +2561,231 @@
           <w:sz w:val="19"/>
           <w:szCs w:val="19"/>
         </w:rPr>
+        <w:t>long</w:t>
+      </w:r>
+      <w:r>
+        <w:rPr>
+          <w:rFonts w:ascii="돋움체" w:eastAsia="돋움체" w:cs="돋움체"/>
+          <w:color w:val="000000"/>
+          <w:kern w:val="0"/>
+          <w:sz w:val="19"/>
+          <w:szCs w:val="19"/>
+        </w:rPr>
+        <w:t xml:space="preserve"> </w:t>
+      </w:r>
+      <w:r>
+        <w:rPr>
+          <w:rFonts w:ascii="돋움체" w:eastAsia="돋움체" w:cs="돋움체"/>
+          <w:color w:val="808080"/>
+          <w:kern w:val="0"/>
+          <w:sz w:val="19"/>
+          <w:szCs w:val="19"/>
+        </w:rPr>
+        <w:t>NHoliday</w:t>
+      </w:r>
+      <w:r>
+        <w:rPr>
+          <w:rFonts w:ascii="돋움체" w:eastAsia="돋움체" w:cs="돋움체"/>
+          <w:color w:val="000000"/>
+          <w:kern w:val="0"/>
+          <w:sz w:val="19"/>
+          <w:szCs w:val="19"/>
+        </w:rPr>
+        <w:t>,</w:t>
+      </w:r>
+      <w:r>
+        <w:rPr>
+          <w:rFonts w:ascii="돋움체" w:eastAsia="돋움체" w:cs="돋움체"/>
+          <w:color w:val="000000"/>
+          <w:kern w:val="0"/>
+          <w:sz w:val="19"/>
+          <w:szCs w:val="19"/>
+        </w:rPr>
+        <w:tab/>
+      </w:r>
+      <w:r>
+        <w:rPr>
+          <w:rFonts w:ascii="돋움체" w:eastAsia="돋움체" w:cs="돋움체"/>
+          <w:color w:val="000000"/>
+          <w:kern w:val="0"/>
+          <w:sz w:val="19"/>
+          <w:szCs w:val="19"/>
+        </w:rPr>
+        <w:tab/>
+      </w:r>
+      <w:r>
+        <w:rPr>
+          <w:rFonts w:ascii="돋움체" w:eastAsia="돋움체" w:cs="돋움체"/>
+          <w:color w:val="000000"/>
+          <w:kern w:val="0"/>
+          <w:sz w:val="19"/>
+          <w:szCs w:val="19"/>
+        </w:rPr>
+        <w:tab/>
+      </w:r>
+      <w:r>
+        <w:rPr>
+          <w:rFonts w:ascii="돋움체" w:eastAsia="돋움체" w:cs="돋움체"/>
+          <w:color w:val="008000"/>
+          <w:kern w:val="0"/>
+          <w:sz w:val="19"/>
+          <w:szCs w:val="19"/>
+        </w:rPr>
+        <w:t>// Holiday</w:t>
+      </w:r>
+      <w:r>
+        <w:rPr>
+          <w:rFonts w:ascii="돋움체" w:eastAsia="돋움체" w:cs="돋움체" w:hint="eastAsia"/>
+          <w:color w:val="008000"/>
+          <w:kern w:val="0"/>
+          <w:sz w:val="19"/>
+          <w:szCs w:val="19"/>
+        </w:rPr>
+        <w:t>개수</w:t>
+      </w:r>
+    </w:p>
+    <w:p>
+      <w:pPr>
+        <w:wordWrap/>
+        <w:adjustRightInd w:val="0"/>
+        <w:spacing w:after="0" w:line="240" w:lineRule="auto"/>
+        <w:jc w:val="left"/>
+        <w:rPr>
+          <w:rFonts w:ascii="돋움체" w:eastAsia="돋움체" w:cs="돋움체"/>
+          <w:color w:val="008000"/>
+          <w:kern w:val="0"/>
+          <w:sz w:val="19"/>
+          <w:szCs w:val="19"/>
+        </w:rPr>
+      </w:pPr>
+      <w:r>
+        <w:rPr>
+          <w:rFonts w:ascii="돋움체" w:eastAsia="돋움체" w:cs="돋움체"/>
+          <w:color w:val="000000"/>
+          <w:kern w:val="0"/>
+          <w:sz w:val="19"/>
+          <w:szCs w:val="19"/>
+        </w:rPr>
+        <w:tab/>
+      </w:r>
+      <w:r>
+        <w:rPr>
+          <w:rFonts w:ascii="돋움체" w:eastAsia="돋움체" w:cs="돋움체"/>
+          <w:color w:val="0000FF"/>
+          <w:kern w:val="0"/>
+          <w:sz w:val="19"/>
+          <w:szCs w:val="19"/>
+        </w:rPr>
+        <w:t>long</w:t>
+      </w:r>
+      <w:r>
+        <w:rPr>
+          <w:rFonts w:ascii="돋움체" w:eastAsia="돋움체" w:cs="돋움체"/>
+          <w:color w:val="000000"/>
+          <w:kern w:val="0"/>
+          <w:sz w:val="19"/>
+          <w:szCs w:val="19"/>
+        </w:rPr>
+        <w:t xml:space="preserve">* </w:t>
+      </w:r>
+      <w:r>
+        <w:rPr>
+          <w:rFonts w:ascii="돋움체" w:eastAsia="돋움체" w:cs="돋움체"/>
+          <w:color w:val="808080"/>
+          <w:kern w:val="0"/>
+          <w:sz w:val="19"/>
+          <w:szCs w:val="19"/>
+        </w:rPr>
+        <w:t>HolidayYYYYMMDD</w:t>
+      </w:r>
+      <w:r>
+        <w:rPr>
+          <w:rFonts w:ascii="돋움체" w:eastAsia="돋움체" w:cs="돋움체"/>
+          <w:color w:val="000000"/>
+          <w:kern w:val="0"/>
+          <w:sz w:val="19"/>
+          <w:szCs w:val="19"/>
+        </w:rPr>
+        <w:t>,</w:t>
+      </w:r>
+      <w:r>
+        <w:rPr>
+          <w:rFonts w:ascii="돋움체" w:eastAsia="돋움체" w:cs="돋움체"/>
+          <w:color w:val="000000"/>
+          <w:kern w:val="0"/>
+          <w:sz w:val="19"/>
+          <w:szCs w:val="19"/>
+        </w:rPr>
+        <w:tab/>
+      </w:r>
+      <w:r>
+        <w:rPr>
+          <w:rFonts w:ascii="돋움체" w:eastAsia="돋움체" w:cs="돋움체"/>
+          <w:color w:val="000000"/>
+          <w:kern w:val="0"/>
+          <w:sz w:val="19"/>
+          <w:szCs w:val="19"/>
+        </w:rPr>
+        <w:tab/>
+      </w:r>
+      <w:r>
+        <w:rPr>
+          <w:rFonts w:ascii="돋움체" w:eastAsia="돋움체" w:cs="돋움체"/>
+          <w:color w:val="008000"/>
+          <w:kern w:val="0"/>
+          <w:sz w:val="19"/>
+          <w:szCs w:val="19"/>
+        </w:rPr>
+        <w:t>// Holiday Array (YYYYMMDD Type)</w:t>
+      </w:r>
+    </w:p>
+    <w:p>
+      <w:pPr>
+        <w:wordWrap/>
+        <w:adjustRightInd w:val="0"/>
+        <w:spacing w:after="0" w:line="240" w:lineRule="auto"/>
+        <w:jc w:val="left"/>
+        <w:rPr>
+          <w:rFonts w:ascii="돋움체" w:eastAsia="돋움체" w:cs="돋움체"/>
+          <w:color w:val="000000"/>
+          <w:kern w:val="0"/>
+          <w:sz w:val="19"/>
+          <w:szCs w:val="19"/>
+        </w:rPr>
+      </w:pPr>
+    </w:p>
+    <w:p>
+      <w:pPr>
+        <w:wordWrap/>
+        <w:adjustRightInd w:val="0"/>
+        <w:spacing w:after="0" w:line="240" w:lineRule="auto"/>
+        <w:jc w:val="left"/>
+        <w:rPr>
+          <w:rFonts w:ascii="돋움체" w:eastAsia="돋움체" w:cs="돋움체"/>
+          <w:color w:val="000000"/>
+          <w:kern w:val="0"/>
+          <w:sz w:val="19"/>
+          <w:szCs w:val="19"/>
+        </w:rPr>
+      </w:pPr>
+      <w:r>
+        <w:rPr>
+          <w:rFonts w:ascii="돋움체" w:eastAsia="돋움체" w:cs="돋움체"/>
+          <w:color w:val="000000"/>
+          <w:kern w:val="0"/>
+          <w:sz w:val="19"/>
+          <w:szCs w:val="19"/>
+        </w:rPr>
+        <w:tab/>
+      </w:r>
+      <w:r>
+        <w:rPr>
+          <w:rFonts w:ascii="돋움체" w:eastAsia="돋움체" w:cs="돋움체"/>
+          <w:color w:val="0000FF"/>
+          <w:kern w:val="0"/>
+          <w:sz w:val="19"/>
+          <w:szCs w:val="19"/>
+        </w:rPr>
         <w:t>double</w:t>
       </w:r>
       <w:r>
@@ -2433,6 +2806,101 @@
           <w:sz w:val="19"/>
           <w:szCs w:val="19"/>
         </w:rPr>
+        <w:t>ResultHazardTerm</w:t>
+      </w:r>
+      <w:r>
+        <w:rPr>
+          <w:rFonts w:ascii="돋움체" w:eastAsia="돋움체" w:cs="돋움체"/>
+          <w:color w:val="000000"/>
+          <w:kern w:val="0"/>
+          <w:sz w:val="19"/>
+          <w:szCs w:val="19"/>
+        </w:rPr>
+        <w:t>,</w:t>
+      </w:r>
+      <w:r>
+        <w:rPr>
+          <w:rFonts w:ascii="돋움체" w:eastAsia="돋움체" w:cs="돋움체"/>
+          <w:color w:val="000000"/>
+          <w:kern w:val="0"/>
+          <w:sz w:val="19"/>
+          <w:szCs w:val="19"/>
+        </w:rPr>
+        <w:tab/>
+      </w:r>
+      <w:r>
+        <w:rPr>
+          <w:rFonts w:ascii="돋움체" w:eastAsia="돋움체" w:cs="돋움체"/>
+          <w:color w:val="000000"/>
+          <w:kern w:val="0"/>
+          <w:sz w:val="19"/>
+          <w:szCs w:val="19"/>
+        </w:rPr>
+        <w:tab/>
+      </w:r>
+      <w:r>
+        <w:rPr>
+          <w:rFonts w:ascii="돋움체" w:eastAsia="돋움체" w:cs="돋움체"/>
+          <w:color w:val="008000"/>
+          <w:kern w:val="0"/>
+          <w:sz w:val="19"/>
+          <w:szCs w:val="19"/>
+        </w:rPr>
+        <w:t>// OutPut Hazard Term</w:t>
+      </w:r>
+    </w:p>
+    <w:p>
+      <w:pPr>
+        <w:wordWrap/>
+        <w:adjustRightInd w:val="0"/>
+        <w:spacing w:after="0" w:line="240" w:lineRule="auto"/>
+        <w:jc w:val="left"/>
+        <w:rPr>
+          <w:rFonts w:ascii="돋움체" w:eastAsia="돋움체" w:cs="돋움체"/>
+          <w:color w:val="000000"/>
+          <w:kern w:val="0"/>
+          <w:sz w:val="19"/>
+          <w:szCs w:val="19"/>
+        </w:rPr>
+      </w:pPr>
+      <w:r>
+        <w:rPr>
+          <w:rFonts w:ascii="돋움체" w:eastAsia="돋움체" w:cs="돋움체"/>
+          <w:color w:val="000000"/>
+          <w:kern w:val="0"/>
+          <w:sz w:val="19"/>
+          <w:szCs w:val="19"/>
+        </w:rPr>
+        <w:tab/>
+      </w:r>
+      <w:r>
+        <w:rPr>
+          <w:rFonts w:ascii="돋움체" w:eastAsia="돋움체" w:cs="돋움체"/>
+          <w:color w:val="0000FF"/>
+          <w:kern w:val="0"/>
+          <w:sz w:val="19"/>
+          <w:szCs w:val="19"/>
+        </w:rPr>
+        <w:t>double</w:t>
+      </w:r>
+      <w:r>
+        <w:rPr>
+          <w:rFonts w:ascii="돋움체" w:eastAsia="돋움체" w:cs="돋움체"/>
+          <w:color w:val="000000"/>
+          <w:kern w:val="0"/>
+          <w:sz w:val="19"/>
+          <w:szCs w:val="19"/>
+        </w:rPr>
+        <w:t xml:space="preserve">* </w:t>
+      </w:r>
+      <w:r>
+        <w:rPr>
+          <w:rFonts w:ascii="돋움체" w:eastAsia="돋움체" w:cs="돋움체"/>
+          <w:color w:val="808080"/>
+          <w:kern w:val="0"/>
+          <w:sz w:val="19"/>
+          <w:szCs w:val="19"/>
+        </w:rPr>
         <w:t>ResultHazard</w:t>
       </w:r>
       <w:r>
@@ -2465,6 +2933,16 @@
         </w:rPr>
         <w:t>// OutPut Hazard Rate</w:t>
       </w:r>
+      <w:r>
+        <w:rPr>
+          <w:rFonts w:ascii="돋움체" w:eastAsia="돋움체" w:cs="돋움체"/>
+          <w:color w:val="000000"/>
+          <w:kern w:val="0"/>
+          <w:sz w:val="19"/>
+          <w:szCs w:val="19"/>
+        </w:rPr>
+        <w:tab/>
+      </w:r>
     </w:p>
     <w:p>
       <w:pPr>
@@ -2501,6 +2979,28 @@
     <w:p>
       <w:pPr>
         <w:rPr>
+          <w:rFonts w:ascii="돋움체" w:eastAsia="돋움체" w:cs="돋움체"/>
+          <w:color w:val="000000"/>
+          <w:kern w:val="0"/>
+          <w:sz w:val="19"/>
+          <w:szCs w:val="19"/>
+        </w:rPr>
+      </w:pPr>
+    </w:p>
+    <w:p>
+      <w:pPr>
+        <w:rPr>
+          <w:rFonts w:ascii="돋움체" w:eastAsia="돋움체" w:cs="돋움체" w:hint="eastAsia"/>
+          <w:color w:val="000000"/>
+          <w:kern w:val="0"/>
+          <w:sz w:val="19"/>
+          <w:szCs w:val="19"/>
+        </w:rPr>
+      </w:pPr>
+    </w:p>
+    <w:p>
+      <w:pPr>
+        <w:rPr>
           <w:b/>
         </w:rPr>
       </w:pPr>
@@ -2508,6 +3008,7 @@
         <w:rPr>
           <w:b/>
         </w:rPr>
+        <w:lastRenderedPageBreak/>
         <w:t>Calc_CDS_Spread</w:t>
       </w:r>
     </w:p>
@@ -4389,7 +4890,6 @@
           <w:sz w:val="19"/>
           <w:szCs w:val="19"/>
         </w:rPr>
-        <w:lastRenderedPageBreak/>
         <w:t>double</w:t>
       </w:r>
       <w:r>
@@ -5400,17 +5900,7 @@
           <w:sz w:val="19"/>
           <w:szCs w:val="19"/>
         </w:rPr>
-        <w:t>*</w:t>
-      </w:r>
-      <w:r>
-        <w:rPr>
-          <w:rFonts w:ascii="돋움체" w:eastAsia="돋움체" w:cs="돋움체"/>
-          <w:color w:val="808080"/>
-          <w:kern w:val="0"/>
-          <w:sz w:val="19"/>
-          <w:szCs w:val="19"/>
-        </w:rPr>
-        <w:t>Holiday</w:t>
+        <w:t>*Holiday</w:t>
       </w:r>
       <w:r>
         <w:rPr>
@@ -5460,17 +5950,7 @@
           <w:sz w:val="19"/>
           <w:szCs w:val="19"/>
         </w:rPr>
-        <w:t>공휴</w:t>
-      </w:r>
-      <w:r>
-        <w:rPr>
-          <w:rFonts w:ascii="돋움체" w:eastAsia="돋움체" w:cs="돋움체" w:hint="eastAsia"/>
-          <w:color w:val="008000"/>
-          <w:kern w:val="0"/>
-          <w:sz w:val="19"/>
-          <w:szCs w:val="19"/>
-        </w:rPr>
-        <w:t>일YYYYMMDD</w:t>
+        <w:t>공휴일YYYYMMDD</w:t>
       </w:r>
     </w:p>
     <w:p>
@@ -5481,7 +5961,7 @@
         <w:ind w:leftChars="200" w:left="400"/>
         <w:jc w:val="left"/>
         <w:rPr>
-          <w:rFonts w:ascii="돋움체" w:eastAsia="돋움체" w:cs="돋움체" w:hint="eastAsia"/>
+          <w:rFonts w:ascii="돋움체" w:eastAsia="돋움체" w:cs="돋움체"/>
           <w:color w:val="000000"/>
           <w:kern w:val="0"/>
           <w:sz w:val="19"/>
@@ -6376,7 +6856,7 @@
         <w:wordWrap/>
         <w:adjustRightInd w:val="0"/>
         <w:spacing w:after="0" w:line="240" w:lineRule="auto"/>
-        <w:ind w:leftChars="200" w:left="400"/>
+        <w:ind w:firstLineChars="200" w:firstLine="380"/>
         <w:jc w:val="left"/>
         <w:rPr>
           <w:rFonts w:ascii="돋움체" w:eastAsia="돋움체" w:cs="돋움체"/>
@@ -6492,7 +6972,7 @@
         <w:wordWrap/>
         <w:adjustRightInd w:val="0"/>
         <w:spacing w:after="0" w:line="240" w:lineRule="auto"/>
-        <w:ind w:leftChars="200" w:left="400"/>
+        <w:ind w:firstLineChars="200" w:firstLine="380"/>
         <w:jc w:val="left"/>
         <w:rPr>
           <w:rFonts w:ascii="돋움체" w:eastAsia="돋움체" w:cs="돋움체"/>
@@ -6588,7 +7068,7 @@
         <w:wordWrap/>
         <w:adjustRightInd w:val="0"/>
         <w:spacing w:after="0" w:line="240" w:lineRule="auto"/>
-        <w:ind w:leftChars="200" w:left="400"/>
+        <w:ind w:firstLineChars="200" w:firstLine="380"/>
         <w:jc w:val="left"/>
         <w:rPr>
           <w:rFonts w:ascii="돋움체" w:eastAsia="돋움체" w:cs="돋움체"/>
@@ -6694,7 +7174,6 @@
         <w:wordWrap/>
         <w:adjustRightInd w:val="0"/>
         <w:spacing w:after="0" w:line="240" w:lineRule="auto"/>
-        <w:ind w:leftChars="200" w:left="400"/>
         <w:jc w:val="left"/>
         <w:rPr>
           <w:rFonts w:ascii="돋움체" w:eastAsia="돋움체" w:cs="돋움체"/>
@@ -6710,7 +7189,7 @@
         <w:wordWrap/>
         <w:adjustRightInd w:val="0"/>
         <w:spacing w:after="0" w:line="240" w:lineRule="auto"/>
-        <w:ind w:leftChars="200" w:left="400"/>
+        <w:ind w:firstLineChars="200" w:firstLine="380"/>
         <w:jc w:val="left"/>
         <w:rPr>
           <w:rFonts w:ascii="돋움체" w:eastAsia="돋움체" w:cs="돋움체"/>
@@ -6816,7 +7295,7 @@
         <w:wordWrap/>
         <w:adjustRightInd w:val="0"/>
         <w:spacing w:after="0" w:line="240" w:lineRule="auto"/>
-        <w:ind w:leftChars="200" w:left="400"/>
+        <w:ind w:firstLineChars="200" w:firstLine="380"/>
         <w:jc w:val="left"/>
         <w:rPr>
           <w:rFonts w:ascii="돋움체" w:eastAsia="돋움체" w:cs="돋움체"/>
@@ -6912,7 +7391,7 @@
         <w:wordWrap/>
         <w:adjustRightInd w:val="0"/>
         <w:spacing w:after="0" w:line="240" w:lineRule="auto"/>
-        <w:ind w:leftChars="200" w:left="400"/>
+        <w:ind w:firstLineChars="200" w:firstLine="380"/>
         <w:jc w:val="left"/>
         <w:rPr>
           <w:rFonts w:ascii="돋움체" w:eastAsia="돋움체" w:cs="돋움체"/>
@@ -7008,7 +7487,6 @@
         <w:wordWrap/>
         <w:adjustRightInd w:val="0"/>
         <w:spacing w:after="0" w:line="240" w:lineRule="auto"/>
-        <w:ind w:leftChars="200" w:left="400"/>
         <w:jc w:val="left"/>
         <w:rPr>
           <w:rFonts w:ascii="돋움체" w:eastAsia="돋움체" w:cs="돋움체"/>
@@ -7024,7 +7502,7 @@
         <w:wordWrap/>
         <w:adjustRightInd w:val="0"/>
         <w:spacing w:after="0" w:line="240" w:lineRule="auto"/>
-        <w:ind w:leftChars="200" w:left="400"/>
+        <w:ind w:firstLineChars="200" w:firstLine="380"/>
         <w:jc w:val="left"/>
         <w:rPr>
           <w:rFonts w:ascii="돋움체" w:eastAsia="돋움체" w:cs="돋움체"/>
@@ -7180,7 +7658,7 @@
         <w:wordWrap/>
         <w:adjustRightInd w:val="0"/>
         <w:spacing w:after="0" w:line="240" w:lineRule="auto"/>
-        <w:ind w:leftChars="200" w:left="400"/>
+        <w:ind w:firstLineChars="200" w:firstLine="380"/>
         <w:jc w:val="left"/>
         <w:rPr>
           <w:rFonts w:ascii="돋움체" w:eastAsia="돋움체" w:cs="돋움체"/>
@@ -7276,7 +7754,7 @@
         <w:wordWrap/>
         <w:adjustRightInd w:val="0"/>
         <w:spacing w:after="0" w:line="240" w:lineRule="auto"/>
-        <w:ind w:leftChars="200" w:left="400"/>
+        <w:ind w:firstLineChars="200" w:firstLine="380"/>
         <w:jc w:val="left"/>
         <w:rPr>
           <w:rFonts w:ascii="돋움체" w:eastAsia="돋움체" w:cs="돋움체"/>
@@ -7352,7 +7830,7 @@
         <w:wordWrap/>
         <w:adjustRightInd w:val="0"/>
         <w:spacing w:after="0" w:line="240" w:lineRule="auto"/>
-        <w:ind w:leftChars="200" w:left="400"/>
+        <w:ind w:firstLineChars="200" w:firstLine="380"/>
         <w:jc w:val="left"/>
         <w:rPr>
           <w:rFonts w:ascii="돋움체" w:eastAsia="돋움체" w:cs="돋움체"/>
@@ -7438,7 +7916,7 @@
         <w:wordWrap/>
         <w:adjustRightInd w:val="0"/>
         <w:spacing w:after="0" w:line="240" w:lineRule="auto"/>
-        <w:ind w:leftChars="200" w:left="400"/>
+        <w:ind w:firstLineChars="200" w:firstLine="380"/>
         <w:jc w:val="left"/>
         <w:rPr>
           <w:rFonts w:ascii="돋움체" w:eastAsia="돋움체" w:cs="돋움체"/>
@@ -7594,7 +8072,6 @@
         <w:wordWrap/>
         <w:adjustRightInd w:val="0"/>
         <w:spacing w:after="0" w:line="240" w:lineRule="auto"/>
-        <w:ind w:leftChars="200" w:left="400"/>
         <w:jc w:val="left"/>
         <w:rPr>
           <w:rFonts w:ascii="돋움체" w:eastAsia="돋움체" w:cs="돋움체"/>
@@ -7610,7 +8087,7 @@
         <w:wordWrap/>
         <w:adjustRightInd w:val="0"/>
         <w:spacing w:after="0" w:line="240" w:lineRule="auto"/>
-        <w:ind w:leftChars="200" w:left="400"/>
+        <w:ind w:firstLineChars="200" w:firstLine="380"/>
         <w:jc w:val="left"/>
         <w:rPr>
           <w:rFonts w:ascii="돋움체" w:eastAsia="돋움체" w:cs="돋움체"/>
@@ -7746,7 +8223,7 @@
         <w:wordWrap/>
         <w:adjustRightInd w:val="0"/>
         <w:spacing w:after="0" w:line="240" w:lineRule="auto"/>
-        <w:ind w:leftChars="200" w:left="400"/>
+        <w:ind w:firstLineChars="200" w:firstLine="380"/>
         <w:jc w:val="left"/>
         <w:rPr>
           <w:rFonts w:ascii="돋움체" w:eastAsia="돋움체" w:cs="돋움체"/>
@@ -7832,7 +8309,7 @@
         <w:wordWrap/>
         <w:adjustRightInd w:val="0"/>
         <w:spacing w:after="0" w:line="240" w:lineRule="auto"/>
-        <w:ind w:leftChars="200" w:left="400"/>
+        <w:ind w:firstLineChars="200" w:firstLine="380"/>
         <w:jc w:val="left"/>
         <w:rPr>
           <w:rFonts w:ascii="돋움체" w:eastAsia="돋움체" w:cs="돋움체"/>
@@ -7918,7 +8395,7 @@
         <w:wordWrap/>
         <w:adjustRightInd w:val="0"/>
         <w:spacing w:after="0" w:line="240" w:lineRule="auto"/>
-        <w:ind w:leftChars="200" w:left="400"/>
+        <w:ind w:firstLineChars="200" w:firstLine="380"/>
         <w:jc w:val="left"/>
         <w:rPr>
           <w:rFonts w:ascii="돋움체" w:eastAsia="돋움체" w:cs="돋움체"/>
@@ -7994,7 +8471,7 @@
         <w:wordWrap/>
         <w:adjustRightInd w:val="0"/>
         <w:spacing w:after="0" w:line="240" w:lineRule="auto"/>
-        <w:ind w:leftChars="200" w:left="400"/>
+        <w:ind w:firstLineChars="200" w:firstLine="380"/>
         <w:jc w:val="left"/>
         <w:rPr>
           <w:rFonts w:ascii="돋움체" w:eastAsia="돋움체" w:cs="돋움체"/>
@@ -8100,7 +8577,6 @@
         <w:wordWrap/>
         <w:adjustRightInd w:val="0"/>
         <w:spacing w:after="0" w:line="240" w:lineRule="auto"/>
-        <w:ind w:leftChars="200" w:left="400"/>
         <w:jc w:val="left"/>
         <w:rPr>
           <w:rFonts w:ascii="돋움체" w:eastAsia="돋움체" w:cs="돋움체"/>
@@ -8116,7 +8592,7 @@
         <w:wordWrap/>
         <w:adjustRightInd w:val="0"/>
         <w:spacing w:after="0" w:line="240" w:lineRule="auto"/>
-        <w:ind w:leftChars="200" w:left="400"/>
+        <w:ind w:firstLineChars="200" w:firstLine="380"/>
         <w:jc w:val="left"/>
         <w:rPr>
           <w:rFonts w:ascii="돋움체" w:eastAsia="돋움체" w:cs="돋움체"/>
@@ -8212,7 +8688,7 @@
         <w:wordWrap/>
         <w:adjustRightInd w:val="0"/>
         <w:spacing w:after="0" w:line="240" w:lineRule="auto"/>
-        <w:ind w:leftChars="200" w:left="400"/>
+        <w:ind w:firstLineChars="200" w:firstLine="380"/>
         <w:jc w:val="left"/>
         <w:rPr>
           <w:rFonts w:ascii="돋움체" w:eastAsia="돋움체" w:cs="돋움체"/>
@@ -8338,7 +8814,7 @@
         <w:wordWrap/>
         <w:adjustRightInd w:val="0"/>
         <w:spacing w:after="0" w:line="240" w:lineRule="auto"/>
-        <w:ind w:leftChars="200" w:left="400"/>
+        <w:ind w:firstLineChars="200" w:firstLine="380"/>
         <w:jc w:val="left"/>
         <w:rPr>
           <w:rFonts w:ascii="돋움체" w:eastAsia="돋움체" w:cs="돋움체"/>
@@ -8474,7 +8950,7 @@
         <w:wordWrap/>
         <w:adjustRightInd w:val="0"/>
         <w:spacing w:after="0" w:line="240" w:lineRule="auto"/>
-        <w:ind w:leftChars="200" w:left="400"/>
+        <w:ind w:firstLineChars="200" w:firstLine="380"/>
         <w:jc w:val="left"/>
         <w:rPr>
           <w:rFonts w:ascii="돋움체" w:eastAsia="돋움체" w:cs="돋움체"/>
@@ -8570,7 +9046,7 @@
         <w:wordWrap/>
         <w:adjustRightInd w:val="0"/>
         <w:spacing w:after="0" w:line="240" w:lineRule="auto"/>
-        <w:ind w:leftChars="200" w:left="400"/>
+        <w:ind w:firstLineChars="200" w:firstLine="380"/>
         <w:jc w:val="left"/>
         <w:rPr>
           <w:rFonts w:ascii="돋움체" w:eastAsia="돋움체" w:cs="돋움체"/>
@@ -8666,7 +9142,7 @@
         <w:wordWrap/>
         <w:adjustRightInd w:val="0"/>
         <w:spacing w:after="0" w:line="240" w:lineRule="auto"/>
-        <w:ind w:leftChars="200" w:left="400"/>
+        <w:ind w:firstLineChars="200" w:firstLine="380"/>
         <w:jc w:val="left"/>
         <w:rPr>
           <w:rFonts w:ascii="돋움체" w:eastAsia="돋움체" w:cs="돋움체"/>
@@ -8704,17 +9180,7 @@
           <w:sz w:val="19"/>
           <w:szCs w:val="19"/>
         </w:rPr>
-        <w:t>ResetDate</w:t>
-      </w:r>
-      <w:r>
-        <w:rPr>
-          <w:rFonts w:ascii="돋움체" w:eastAsia="돋움체" w:cs="돋움체"/>
-          <w:color w:val="808080"/>
-          <w:kern w:val="0"/>
-          <w:sz w:val="19"/>
-          <w:szCs w:val="19"/>
-        </w:rPr>
-        <w:t>YYYYMMDD</w:t>
+        <w:t>ResetDateYYYYMMDD</w:t>
       </w:r>
       <w:r>
         <w:rPr>
@@ -8772,7 +9238,7 @@
         <w:wordWrap/>
         <w:adjustRightInd w:val="0"/>
         <w:spacing w:after="0" w:line="240" w:lineRule="auto"/>
-        <w:ind w:leftChars="200" w:left="400"/>
+        <w:ind w:firstLineChars="200" w:firstLine="380"/>
         <w:jc w:val="left"/>
         <w:rPr>
           <w:rFonts w:ascii="돋움체" w:eastAsia="돋움체" w:cs="돋움체"/>
@@ -8810,17 +9276,7 @@
           <w:sz w:val="19"/>
           <w:szCs w:val="19"/>
         </w:rPr>
-        <w:t>PayDate</w:t>
-      </w:r>
-      <w:r>
-        <w:rPr>
-          <w:rFonts w:ascii="돋움체" w:eastAsia="돋움체" w:cs="돋움체"/>
-          <w:color w:val="808080"/>
-          <w:kern w:val="0"/>
-          <w:sz w:val="19"/>
-          <w:szCs w:val="19"/>
-        </w:rPr>
-        <w:t>YYYYMMDD</w:t>
+        <w:t>PayDateYYYYMMDD</w:t>
       </w:r>
       <w:r>
         <w:rPr>
@@ -8878,11 +9334,11 @@
         <w:wordWrap/>
         <w:adjustRightInd w:val="0"/>
         <w:spacing w:after="0" w:line="240" w:lineRule="auto"/>
-        <w:ind w:leftChars="200" w:left="400"/>
+        <w:ind w:firstLineChars="200" w:firstLine="380"/>
         <w:jc w:val="left"/>
         <w:rPr>
           <w:rFonts w:ascii="돋움체" w:eastAsia="돋움체" w:cs="돋움체"/>
-          <w:color w:val="008000"/>
+          <w:color w:val="000000"/>
           <w:kern w:val="0"/>
           <w:sz w:val="19"/>
           <w:szCs w:val="19"/>
@@ -8916,17 +9372,7 @@
           <w:sz w:val="19"/>
           <w:szCs w:val="19"/>
         </w:rPr>
-        <w:t>PricingDate</w:t>
-      </w:r>
-      <w:r>
-        <w:rPr>
-          <w:rFonts w:ascii="돋움체" w:eastAsia="돋움체" w:cs="돋움체"/>
-          <w:color w:val="808080"/>
-          <w:kern w:val="0"/>
-          <w:sz w:val="19"/>
-          <w:szCs w:val="19"/>
-        </w:rPr>
-        <w:t>YYYYMMDD</w:t>
+        <w:t>PricingDateYYYYMMDD</w:t>
       </w:r>
       <w:r>
         <w:rPr>
@@ -8978,116 +9424,32 @@
         </w:rPr>
         <w:t xml:space="preserve"> </w:t>
       </w:r>
-      <w:bookmarkStart w:id="0" w:name="_GoBack"/>
-      <w:bookmarkEnd w:id="0"/>
     </w:p>
     <w:p>
       <w:pPr>
         <w:wordWrap/>
         <w:adjustRightInd w:val="0"/>
         <w:spacing w:after="0" w:line="240" w:lineRule="auto"/>
-        <w:ind w:leftChars="200" w:left="400"/>
         <w:jc w:val="left"/>
         <w:rPr>
           <w:rFonts w:ascii="돋움체" w:eastAsia="돋움체" w:cs="돋움체"/>
-          <w:color w:val="008000"/>
-          <w:kern w:val="0"/>
-          <w:sz w:val="19"/>
-          <w:szCs w:val="19"/>
-        </w:rPr>
-      </w:pPr>
-      <w:r>
-        <w:rPr>
-          <w:rFonts w:ascii="돋움체" w:eastAsia="돋움체" w:cs="돋움체"/>
-          <w:color w:val="0000FF"/>
-          <w:kern w:val="0"/>
-          <w:sz w:val="19"/>
-          <w:szCs w:val="19"/>
-        </w:rPr>
-        <w:lastRenderedPageBreak/>
-        <w:t>long</w:t>
-      </w:r>
-      <w:r>
-        <w:rPr>
-          <w:rFonts w:ascii="돋움체" w:eastAsia="돋움체" w:cs="돋움체"/>
-          <w:color w:val="000000"/>
-          <w:kern w:val="0"/>
-          <w:sz w:val="19"/>
-          <w:szCs w:val="19"/>
-        </w:rPr>
-        <w:t xml:space="preserve"> </w:t>
-      </w:r>
-      <w:r>
-        <w:rPr>
-          <w:rFonts w:ascii="돋움체" w:eastAsia="돋움체" w:cs="돋움체"/>
-          <w:color w:val="808080"/>
-          <w:kern w:val="0"/>
-          <w:sz w:val="19"/>
-          <w:szCs w:val="19"/>
-        </w:rPr>
-        <w:t>NHoliday</w:t>
-      </w:r>
-      <w:r>
-        <w:rPr>
-          <w:rFonts w:ascii="돋움체" w:eastAsia="돋움체" w:cs="돋움체"/>
-          <w:color w:val="000000"/>
-          <w:kern w:val="0"/>
-          <w:sz w:val="19"/>
-          <w:szCs w:val="19"/>
-        </w:rPr>
-        <w:t>,</w:t>
-      </w:r>
-      <w:r>
-        <w:rPr>
-          <w:rFonts w:ascii="돋움체" w:eastAsia="돋움체" w:cs="돋움체"/>
-          <w:color w:val="000000"/>
-          <w:kern w:val="0"/>
-          <w:sz w:val="19"/>
-          <w:szCs w:val="19"/>
-        </w:rPr>
-        <w:tab/>
-      </w:r>
-      <w:r>
-        <w:rPr>
-          <w:rFonts w:ascii="돋움체" w:eastAsia="돋움체" w:cs="돋움체"/>
-          <w:color w:val="000000"/>
-          <w:kern w:val="0"/>
-          <w:sz w:val="19"/>
-          <w:szCs w:val="19"/>
-        </w:rPr>
-        <w:tab/>
-      </w:r>
-      <w:r>
-        <w:rPr>
-          <w:rFonts w:ascii="돋움체" w:eastAsia="돋움체" w:cs="돋움체"/>
-          <w:color w:val="008000"/>
-          <w:kern w:val="0"/>
-          <w:sz w:val="19"/>
-          <w:szCs w:val="19"/>
-        </w:rPr>
-        <w:t xml:space="preserve">// </w:t>
-      </w:r>
-      <w:r>
-        <w:rPr>
-          <w:rFonts w:ascii="돋움체" w:eastAsia="돋움체" w:cs="돋움체" w:hint="eastAsia"/>
-          <w:color w:val="008000"/>
-          <w:kern w:val="0"/>
-          <w:sz w:val="19"/>
-          <w:szCs w:val="19"/>
-        </w:rPr>
-        <w:t>공휴일수</w:t>
-      </w:r>
+          <w:color w:val="000000"/>
+          <w:kern w:val="0"/>
+          <w:sz w:val="19"/>
+          <w:szCs w:val="19"/>
+        </w:rPr>
+      </w:pPr>
     </w:p>
     <w:p>
       <w:pPr>
         <w:wordWrap/>
         <w:adjustRightInd w:val="0"/>
         <w:spacing w:after="0" w:line="240" w:lineRule="auto"/>
-        <w:ind w:leftChars="200" w:left="400"/>
+        <w:ind w:firstLineChars="200" w:firstLine="380"/>
         <w:jc w:val="left"/>
         <w:rPr>
-          <w:rFonts w:ascii="돋움체" w:eastAsia="돋움체" w:cs="돋움체" w:hint="eastAsia"/>
-          <w:color w:val="008000"/>
+          <w:rFonts w:ascii="돋움체" w:eastAsia="돋움체" w:cs="돋움체"/>
+          <w:color w:val="000000"/>
           <w:kern w:val="0"/>
           <w:sz w:val="19"/>
           <w:szCs w:val="19"/>
@@ -9121,7 +9483,7 @@
           <w:sz w:val="19"/>
           <w:szCs w:val="19"/>
         </w:rPr>
-        <w:t>*Holiday</w:t>
+        <w:t>NHoliday</w:t>
       </w:r>
       <w:r>
         <w:rPr>
@@ -9132,46 +9494,6 @@
           <w:szCs w:val="19"/>
         </w:rPr>
         <w:t>,</w:t>
-      </w:r>
-      <w:r>
-        <w:rPr>
-          <w:rFonts w:ascii="돋움체" w:eastAsia="돋움체" w:cs="돋움체"/>
-          <w:color w:val="000000"/>
-          <w:kern w:val="0"/>
-          <w:sz w:val="19"/>
-          <w:szCs w:val="19"/>
-        </w:rPr>
-        <w:tab/>
-      </w:r>
-      <w:r>
-        <w:rPr>
-          <w:rFonts w:ascii="돋움체" w:eastAsia="돋움체" w:cs="돋움체"/>
-          <w:color w:val="000000"/>
-          <w:kern w:val="0"/>
-          <w:sz w:val="19"/>
-          <w:szCs w:val="19"/>
-        </w:rPr>
-        <w:tab/>
-      </w:r>
-      <w:r>
-        <w:rPr>
-          <w:rFonts w:ascii="돋움체" w:eastAsia="돋움체" w:cs="돋움체"/>
-          <w:color w:val="008000"/>
-          <w:kern w:val="0"/>
-          <w:sz w:val="19"/>
-          <w:szCs w:val="19"/>
-        </w:rPr>
-        <w:t xml:space="preserve">// </w:t>
-      </w:r>
-      <w:r>
-        <w:rPr>
-          <w:rFonts w:ascii="돋움체" w:eastAsia="돋움체" w:cs="돋움체" w:hint="eastAsia"/>
-          <w:color w:val="008000"/>
-          <w:kern w:val="0"/>
-          <w:sz w:val="19"/>
-          <w:szCs w:val="19"/>
-        </w:rPr>
-        <w:t>공휴일YYYYMMDD</w:t>
       </w:r>
     </w:p>
     <w:p>
@@ -9179,7 +9501,7 @@
         <w:wordWrap/>
         <w:adjustRightInd w:val="0"/>
         <w:spacing w:after="0" w:line="240" w:lineRule="auto"/>
-        <w:ind w:leftChars="200" w:left="400"/>
+        <w:ind w:firstLineChars="200" w:firstLine="380"/>
         <w:jc w:val="left"/>
         <w:rPr>
           <w:rFonts w:ascii="돋움체" w:eastAsia="돋움체" w:cs="돋움체"/>
@@ -9189,13 +9511,52 @@
           <w:szCs w:val="19"/>
         </w:rPr>
       </w:pPr>
+      <w:r>
+        <w:rPr>
+          <w:rFonts w:ascii="돋움체" w:eastAsia="돋움체" w:cs="돋움체"/>
+          <w:color w:val="0000FF"/>
+          <w:kern w:val="0"/>
+          <w:sz w:val="19"/>
+          <w:szCs w:val="19"/>
+        </w:rPr>
+        <w:t>long</w:t>
+      </w:r>
+      <w:r>
+        <w:rPr>
+          <w:rFonts w:ascii="돋움체" w:eastAsia="돋움체" w:cs="돋움체"/>
+          <w:color w:val="000000"/>
+          <w:kern w:val="0"/>
+          <w:sz w:val="19"/>
+          <w:szCs w:val="19"/>
+        </w:rPr>
+        <w:t xml:space="preserve"> *</w:t>
+      </w:r>
+      <w:r>
+        <w:rPr>
+          <w:rFonts w:ascii="돋움체" w:eastAsia="돋움체" w:cs="돋움체"/>
+          <w:color w:val="808080"/>
+          <w:kern w:val="0"/>
+          <w:sz w:val="19"/>
+          <w:szCs w:val="19"/>
+        </w:rPr>
+        <w:t>HolidayYYYYMMDD</w:t>
+      </w:r>
+      <w:r>
+        <w:rPr>
+          <w:rFonts w:ascii="돋움체" w:eastAsia="돋움체" w:cs="돋움체"/>
+          <w:color w:val="000000"/>
+          <w:kern w:val="0"/>
+          <w:sz w:val="19"/>
+          <w:szCs w:val="19"/>
+        </w:rPr>
+        <w:t>,</w:t>
+      </w:r>
     </w:p>
     <w:p>
       <w:pPr>
         <w:wordWrap/>
         <w:adjustRightInd w:val="0"/>
         <w:spacing w:after="0" w:line="240" w:lineRule="auto"/>
-        <w:ind w:leftChars="200" w:left="400"/>
         <w:jc w:val="left"/>
         <w:rPr>
           <w:rFonts w:ascii="돋움체" w:eastAsia="돋움체" w:cs="돋움체"/>
@@ -9205,113 +9566,13 @@
           <w:szCs w:val="19"/>
         </w:rPr>
       </w:pPr>
-      <w:r>
-        <w:rPr>
-          <w:rFonts w:ascii="돋움체" w:eastAsia="돋움체" w:cs="돋움체"/>
-          <w:color w:val="0000FF"/>
-          <w:kern w:val="0"/>
-          <w:sz w:val="19"/>
-          <w:szCs w:val="19"/>
-        </w:rPr>
-        <w:t>double</w:t>
-      </w:r>
-      <w:r>
-        <w:rPr>
-          <w:rFonts w:ascii="돋움체" w:eastAsia="돋움체" w:cs="돋움체"/>
-          <w:color w:val="000000"/>
-          <w:kern w:val="0"/>
-          <w:sz w:val="19"/>
-          <w:szCs w:val="19"/>
-        </w:rPr>
-        <w:t xml:space="preserve"> </w:t>
-      </w:r>
-      <w:r>
-        <w:rPr>
-          <w:rFonts w:ascii="돋움체" w:eastAsia="돋움체" w:cs="돋움체"/>
-          <w:color w:val="808080"/>
-          <w:kern w:val="0"/>
-          <w:sz w:val="19"/>
-          <w:szCs w:val="19"/>
-        </w:rPr>
-        <w:t>OLD_CDS_Spread</w:t>
-      </w:r>
-      <w:r>
-        <w:rPr>
-          <w:rFonts w:ascii="돋움체" w:eastAsia="돋움체" w:cs="돋움체"/>
-          <w:color w:val="000000"/>
-          <w:kern w:val="0"/>
-          <w:sz w:val="19"/>
-          <w:szCs w:val="19"/>
-        </w:rPr>
-        <w:t>,</w:t>
-      </w:r>
-      <w:r>
-        <w:rPr>
-          <w:rFonts w:ascii="돋움체" w:eastAsia="돋움체" w:cs="돋움체"/>
-          <w:color w:val="000000"/>
-          <w:kern w:val="0"/>
-          <w:sz w:val="19"/>
-          <w:szCs w:val="19"/>
-        </w:rPr>
-        <w:tab/>
-      </w:r>
-      <w:r>
-        <w:rPr>
-          <w:rFonts w:ascii="돋움체" w:eastAsia="돋움체" w:cs="돋움체"/>
-          <w:color w:val="008000"/>
-          <w:kern w:val="0"/>
-          <w:sz w:val="19"/>
-          <w:szCs w:val="19"/>
-        </w:rPr>
-        <w:t xml:space="preserve">// </w:t>
-      </w:r>
-      <w:r>
-        <w:rPr>
-          <w:rFonts w:ascii="돋움체" w:eastAsia="돋움체" w:cs="돋움체" w:hint="eastAsia"/>
-          <w:color w:val="008000"/>
-          <w:kern w:val="0"/>
-          <w:sz w:val="19"/>
-          <w:szCs w:val="19"/>
-        </w:rPr>
-        <w:t>예전</w:t>
-      </w:r>
-      <w:r>
-        <w:rPr>
-          <w:rFonts w:ascii="돋움체" w:eastAsia="돋움체" w:cs="돋움체"/>
-          <w:color w:val="008000"/>
-          <w:kern w:val="0"/>
-          <w:sz w:val="19"/>
-          <w:szCs w:val="19"/>
-        </w:rPr>
-        <w:t xml:space="preserve"> </w:t>
-      </w:r>
-      <w:r>
-        <w:rPr>
-          <w:rFonts w:ascii="돋움체" w:eastAsia="돋움체" w:cs="돋움체" w:hint="eastAsia"/>
-          <w:color w:val="008000"/>
-          <w:kern w:val="0"/>
-          <w:sz w:val="19"/>
-          <w:szCs w:val="19"/>
-        </w:rPr>
-        <w:t>계약</w:t>
-      </w:r>
-      <w:r>
-        <w:rPr>
-          <w:rFonts w:ascii="돋움체" w:eastAsia="돋움체" w:cs="돋움체"/>
-          <w:color w:val="008000"/>
-          <w:kern w:val="0"/>
-          <w:sz w:val="19"/>
-          <w:szCs w:val="19"/>
-        </w:rPr>
-        <w:t xml:space="preserve"> CDS Spread</w:t>
-      </w:r>
     </w:p>
     <w:p>
       <w:pPr>
         <w:wordWrap/>
         <w:adjustRightInd w:val="0"/>
         <w:spacing w:after="0" w:line="240" w:lineRule="auto"/>
-        <w:ind w:leftChars="200" w:left="400"/>
+        <w:ind w:firstLineChars="200" w:firstLine="380"/>
         <w:jc w:val="left"/>
         <w:rPr>
           <w:rFonts w:ascii="돋움체" w:eastAsia="돋움체" w:cs="돋움체"/>
@@ -9329,7 +9590,7 @@
           <w:sz w:val="19"/>
           <w:szCs w:val="19"/>
         </w:rPr>
-        <w:t>long</w:t>
+        <w:t>double</w:t>
       </w:r>
       <w:r>
         <w:rPr>
@@ -9349,7 +9610,7 @@
           <w:sz w:val="19"/>
           <w:szCs w:val="19"/>
         </w:rPr>
-        <w:t>Protection_Position</w:t>
+        <w:t>OLD_CDS_Spread</w:t>
       </w:r>
       <w:r>
         <w:rPr>
@@ -9389,47 +9650,37 @@
           <w:sz w:val="19"/>
           <w:szCs w:val="19"/>
         </w:rPr>
-        <w:t>포지션</w:t>
-      </w:r>
-      <w:r>
-        <w:rPr>
-          <w:rFonts w:ascii="돋움체" w:eastAsia="돋움체" w:cs="돋움체"/>
-          <w:color w:val="008000"/>
-          <w:kern w:val="0"/>
-          <w:sz w:val="19"/>
-          <w:szCs w:val="19"/>
-        </w:rPr>
-        <w:t xml:space="preserve">1: </w:t>
-      </w:r>
-      <w:r>
-        <w:rPr>
-          <w:rFonts w:ascii="돋움체" w:eastAsia="돋움체" w:cs="돋움체" w:hint="eastAsia"/>
-          <w:color w:val="008000"/>
-          <w:kern w:val="0"/>
-          <w:sz w:val="19"/>
-          <w:szCs w:val="19"/>
-        </w:rPr>
-        <w:t>롱</w:t>
-      </w:r>
-      <w:r>
-        <w:rPr>
-          <w:rFonts w:ascii="돋움체" w:eastAsia="돋움체" w:cs="돋움체"/>
-          <w:color w:val="008000"/>
-          <w:kern w:val="0"/>
-          <w:sz w:val="19"/>
-          <w:szCs w:val="19"/>
-        </w:rPr>
-        <w:t xml:space="preserve"> -1: </w:t>
-      </w:r>
-      <w:r>
-        <w:rPr>
-          <w:rFonts w:ascii="돋움체" w:eastAsia="돋움체" w:cs="돋움체" w:hint="eastAsia"/>
-          <w:color w:val="008000"/>
-          <w:kern w:val="0"/>
-          <w:sz w:val="19"/>
-          <w:szCs w:val="19"/>
-        </w:rPr>
-        <w:t>숏</w:t>
+        <w:t>예전</w:t>
+      </w:r>
+      <w:r>
+        <w:rPr>
+          <w:rFonts w:ascii="돋움체" w:eastAsia="돋움체" w:cs="돋움체"/>
+          <w:color w:val="008000"/>
+          <w:kern w:val="0"/>
+          <w:sz w:val="19"/>
+          <w:szCs w:val="19"/>
+        </w:rPr>
+        <w:t xml:space="preserve"> </w:t>
+      </w:r>
+      <w:r>
+        <w:rPr>
+          <w:rFonts w:ascii="돋움체" w:eastAsia="돋움체" w:cs="돋움체" w:hint="eastAsia"/>
+          <w:color w:val="008000"/>
+          <w:kern w:val="0"/>
+          <w:sz w:val="19"/>
+          <w:szCs w:val="19"/>
+        </w:rPr>
+        <w:t>계약</w:t>
+      </w:r>
+      <w:r>
+        <w:rPr>
+          <w:rFonts w:ascii="돋움체" w:eastAsia="돋움체" w:cs="돋움체"/>
+          <w:color w:val="008000"/>
+          <w:kern w:val="0"/>
+          <w:sz w:val="19"/>
+          <w:szCs w:val="19"/>
+        </w:rPr>
+        <w:t xml:space="preserve"> CDS Spread</w:t>
       </w:r>
     </w:p>
     <w:p>
@@ -9437,7 +9688,7 @@
         <w:wordWrap/>
         <w:adjustRightInd w:val="0"/>
         <w:spacing w:after="0" w:line="240" w:lineRule="auto"/>
-        <w:ind w:leftChars="200" w:left="400"/>
+        <w:ind w:firstLineChars="200" w:firstLine="380"/>
         <w:jc w:val="left"/>
         <w:rPr>
           <w:rFonts w:ascii="돋움체" w:eastAsia="돋움체" w:cs="돋움체"/>
@@ -9475,7 +9726,7 @@
           <w:sz w:val="19"/>
           <w:szCs w:val="19"/>
         </w:rPr>
-        <w:t>TextFlag</w:t>
+        <w:t>Protection_Position</w:t>
       </w:r>
       <w:r>
         <w:rPr>
@@ -9500,42 +9751,62 @@
       <w:r>
         <w:rPr>
           <w:rFonts w:ascii="돋움체" w:eastAsia="돋움체" w:cs="돋움체"/>
-          <w:color w:val="000000"/>
-          <w:kern w:val="0"/>
-          <w:sz w:val="19"/>
-          <w:szCs w:val="19"/>
-        </w:rPr>
-        <w:tab/>
-      </w:r>
-      <w:r>
-        <w:rPr>
-          <w:rFonts w:ascii="돋움체" w:eastAsia="돋움체" w:cs="돋움체"/>
-          <w:color w:val="008000"/>
-          <w:kern w:val="0"/>
-          <w:sz w:val="19"/>
-          <w:szCs w:val="19"/>
-        </w:rPr>
-        <w:t>// TextFlag (</w:t>
-      </w:r>
-      <w:r>
-        <w:rPr>
-          <w:rFonts w:ascii="돋움체" w:eastAsia="돋움체" w:cs="돋움체" w:hint="eastAsia"/>
-          <w:color w:val="008000"/>
-          <w:kern w:val="0"/>
-          <w:sz w:val="19"/>
-          <w:szCs w:val="19"/>
-        </w:rPr>
-        <w:t>미완성</w:t>
-      </w:r>
-      <w:r>
-        <w:rPr>
-          <w:rFonts w:ascii="돋움체" w:eastAsia="돋움체" w:cs="돋움체"/>
-          <w:color w:val="008000"/>
-          <w:kern w:val="0"/>
-          <w:sz w:val="19"/>
-          <w:szCs w:val="19"/>
-        </w:rPr>
-        <w:t>)</w:t>
+          <w:color w:val="008000"/>
+          <w:kern w:val="0"/>
+          <w:sz w:val="19"/>
+          <w:szCs w:val="19"/>
+        </w:rPr>
+        <w:t xml:space="preserve">// </w:t>
+      </w:r>
+      <w:r>
+        <w:rPr>
+          <w:rFonts w:ascii="돋움체" w:eastAsia="돋움체" w:cs="돋움체" w:hint="eastAsia"/>
+          <w:color w:val="008000"/>
+          <w:kern w:val="0"/>
+          <w:sz w:val="19"/>
+          <w:szCs w:val="19"/>
+        </w:rPr>
+        <w:t>포지션</w:t>
+      </w:r>
+      <w:r>
+        <w:rPr>
+          <w:rFonts w:ascii="돋움체" w:eastAsia="돋움체" w:cs="돋움체"/>
+          <w:color w:val="008000"/>
+          <w:kern w:val="0"/>
+          <w:sz w:val="19"/>
+          <w:szCs w:val="19"/>
+        </w:rPr>
+        <w:t xml:space="preserve">1: </w:t>
+      </w:r>
+      <w:r>
+        <w:rPr>
+          <w:rFonts w:ascii="돋움체" w:eastAsia="돋움체" w:cs="돋움체" w:hint="eastAsia"/>
+          <w:color w:val="008000"/>
+          <w:kern w:val="0"/>
+          <w:sz w:val="19"/>
+          <w:szCs w:val="19"/>
+        </w:rPr>
+        <w:t>롱</w:t>
+      </w:r>
+      <w:r>
+        <w:rPr>
+          <w:rFonts w:ascii="돋움체" w:eastAsia="돋움체" w:cs="돋움체"/>
+          <w:color w:val="008000"/>
+          <w:kern w:val="0"/>
+          <w:sz w:val="19"/>
+          <w:szCs w:val="19"/>
+        </w:rPr>
+        <w:t xml:space="preserve"> -1: </w:t>
+      </w:r>
+      <w:r>
+        <w:rPr>
+          <w:rFonts w:ascii="돋움체" w:eastAsia="돋움체" w:cs="돋움체" w:hint="eastAsia"/>
+          <w:color w:val="008000"/>
+          <w:kern w:val="0"/>
+          <w:sz w:val="19"/>
+          <w:szCs w:val="19"/>
+        </w:rPr>
+        <w:t>숏</w:t>
       </w:r>
     </w:p>
     <w:p>
@@ -9543,7 +9814,7 @@
         <w:wordWrap/>
         <w:adjustRightInd w:val="0"/>
         <w:spacing w:after="0" w:line="240" w:lineRule="auto"/>
-        <w:ind w:leftChars="200" w:left="400"/>
+        <w:ind w:firstLineChars="200" w:firstLine="380"/>
         <w:jc w:val="left"/>
         <w:rPr>
           <w:rFonts w:ascii="돋움체" w:eastAsia="돋움체" w:cs="돋움체"/>
@@ -9581,7 +9852,7 @@
           <w:sz w:val="19"/>
           <w:szCs w:val="19"/>
         </w:rPr>
-        <w:t>GreekFlag</w:t>
+        <w:t>TextFlag</w:t>
       </w:r>
       <w:r>
         <w:rPr>
@@ -9621,27 +9892,27 @@
           <w:sz w:val="19"/>
           <w:szCs w:val="19"/>
         </w:rPr>
-        <w:t>// Greek</w:t>
-      </w:r>
-      <w:r>
-        <w:rPr>
-          <w:rFonts w:ascii="돋움체" w:eastAsia="돋움체" w:cs="돋움체" w:hint="eastAsia"/>
-          <w:color w:val="008000"/>
-          <w:kern w:val="0"/>
-          <w:sz w:val="19"/>
-          <w:szCs w:val="19"/>
-        </w:rPr>
-        <w:t>산출</w:t>
-      </w:r>
-      <w:r>
-        <w:rPr>
-          <w:rFonts w:ascii="돋움체" w:eastAsia="돋움체" w:cs="돋움체"/>
-          <w:color w:val="008000"/>
-          <w:kern w:val="0"/>
-          <w:sz w:val="19"/>
-          <w:szCs w:val="19"/>
-        </w:rPr>
-        <w:t>Flag</w:t>
+        <w:t>// TextFlag (</w:t>
+      </w:r>
+      <w:r>
+        <w:rPr>
+          <w:rFonts w:ascii="돋움체" w:eastAsia="돋움체" w:cs="돋움체" w:hint="eastAsia"/>
+          <w:color w:val="008000"/>
+          <w:kern w:val="0"/>
+          <w:sz w:val="19"/>
+          <w:szCs w:val="19"/>
+        </w:rPr>
+        <w:t>미완성</w:t>
+      </w:r>
+      <w:r>
+        <w:rPr>
+          <w:rFonts w:ascii="돋움체" w:eastAsia="돋움체" w:cs="돋움체"/>
+          <w:color w:val="008000"/>
+          <w:kern w:val="0"/>
+          <w:sz w:val="19"/>
+          <w:szCs w:val="19"/>
+        </w:rPr>
+        <w:t>)</w:t>
       </w:r>
     </w:p>
     <w:p>
@@ -9649,7 +9920,7 @@
         <w:wordWrap/>
         <w:adjustRightInd w:val="0"/>
         <w:spacing w:after="0" w:line="240" w:lineRule="auto"/>
-        <w:ind w:leftChars="200" w:left="400"/>
+        <w:ind w:firstLineChars="200" w:firstLine="380"/>
         <w:jc w:val="left"/>
         <w:rPr>
           <w:rFonts w:ascii="돋움체" w:eastAsia="돋움체" w:cs="돋움체"/>
@@ -9667,17 +9938,17 @@
           <w:sz w:val="19"/>
           <w:szCs w:val="19"/>
         </w:rPr>
-        <w:t>double</w:t>
-      </w:r>
-      <w:r>
-        <w:rPr>
-          <w:rFonts w:ascii="돋움체" w:eastAsia="돋움체" w:cs="돋움체"/>
-          <w:color w:val="000000"/>
-          <w:kern w:val="0"/>
-          <w:sz w:val="19"/>
-          <w:szCs w:val="19"/>
-        </w:rPr>
-        <w:t xml:space="preserve">* </w:t>
+        <w:t>long</w:t>
+      </w:r>
+      <w:r>
+        <w:rPr>
+          <w:rFonts w:ascii="돋움체" w:eastAsia="돋움체" w:cs="돋움체"/>
+          <w:color w:val="000000"/>
+          <w:kern w:val="0"/>
+          <w:sz w:val="19"/>
+          <w:szCs w:val="19"/>
+        </w:rPr>
+        <w:t xml:space="preserve"> </w:t>
       </w:r>
       <w:r>
         <w:rPr>
@@ -9687,7 +9958,7 @@
           <w:sz w:val="19"/>
           <w:szCs w:val="19"/>
         </w:rPr>
-        <w:t>Result_Value</w:t>
+        <w:t>GreekFlag</w:t>
       </w:r>
       <w:r>
         <w:rPr>
@@ -9727,27 +9998,27 @@
           <w:sz w:val="19"/>
           <w:szCs w:val="19"/>
         </w:rPr>
-        <w:t xml:space="preserve">// </w:t>
-      </w:r>
-      <w:r>
-        <w:rPr>
-          <w:rFonts w:ascii="돋움체" w:eastAsia="돋움체" w:cs="돋움체" w:hint="eastAsia"/>
-          <w:color w:val="008000"/>
-          <w:kern w:val="0"/>
-          <w:sz w:val="19"/>
-          <w:szCs w:val="19"/>
-        </w:rPr>
-        <w:t>결과</w:t>
-      </w:r>
-      <w:r>
-        <w:rPr>
-          <w:rFonts w:ascii="돋움체" w:eastAsia="돋움체" w:cs="돋움체"/>
-          <w:color w:val="008000"/>
-          <w:kern w:val="0"/>
-          <w:sz w:val="19"/>
-          <w:szCs w:val="19"/>
-        </w:rPr>
-        <w:t xml:space="preserve"> [0]: Result_Spread [1]:Premium_Leg [2]:Protection Leg</w:t>
+        <w:t>// Greek</w:t>
+      </w:r>
+      <w:r>
+        <w:rPr>
+          <w:rFonts w:ascii="돋움체" w:eastAsia="돋움체" w:cs="돋움체" w:hint="eastAsia"/>
+          <w:color w:val="008000"/>
+          <w:kern w:val="0"/>
+          <w:sz w:val="19"/>
+          <w:szCs w:val="19"/>
+        </w:rPr>
+        <w:t>산출</w:t>
+      </w:r>
+      <w:r>
+        <w:rPr>
+          <w:rFonts w:ascii="돋움체" w:eastAsia="돋움체" w:cs="돋움체"/>
+          <w:color w:val="008000"/>
+          <w:kern w:val="0"/>
+          <w:sz w:val="19"/>
+          <w:szCs w:val="19"/>
+        </w:rPr>
+        <w:t>Flag</w:t>
       </w:r>
     </w:p>
     <w:p>
@@ -9755,7 +10026,7 @@
         <w:wordWrap/>
         <w:adjustRightInd w:val="0"/>
         <w:spacing w:after="0" w:line="240" w:lineRule="auto"/>
-        <w:ind w:leftChars="200" w:left="400"/>
+        <w:ind w:firstLineChars="200" w:firstLine="380"/>
         <w:jc w:val="left"/>
         <w:rPr>
           <w:rFonts w:ascii="돋움체" w:eastAsia="돋움체" w:cs="돋움체"/>
@@ -9793,7 +10064,7 @@
           <w:sz w:val="19"/>
           <w:szCs w:val="19"/>
         </w:rPr>
-        <w:t>ResultHazardRate</w:t>
+        <w:t>Result_Value</w:t>
       </w:r>
       <w:r>
         <w:rPr>
@@ -9818,6 +10089,16 @@
       <w:r>
         <w:rPr>
           <w:rFonts w:ascii="돋움체" w:eastAsia="돋움체" w:cs="돋움체"/>
+          <w:color w:val="000000"/>
+          <w:kern w:val="0"/>
+          <w:sz w:val="19"/>
+          <w:szCs w:val="19"/>
+        </w:rPr>
+        <w:tab/>
+      </w:r>
+      <w:r>
+        <w:rPr>
+          <w:rFonts w:ascii="돋움체" w:eastAsia="돋움체" w:cs="돋움체"/>
           <w:color w:val="008000"/>
           <w:kern w:val="0"/>
           <w:sz w:val="19"/>
@@ -9833,17 +10114,17 @@
           <w:sz w:val="19"/>
           <w:szCs w:val="19"/>
         </w:rPr>
-        <w:t>산출된</w:t>
-      </w:r>
-      <w:r>
-        <w:rPr>
-          <w:rFonts w:ascii="돋움체" w:eastAsia="돋움체" w:cs="돋움체"/>
-          <w:color w:val="008000"/>
-          <w:kern w:val="0"/>
-          <w:sz w:val="19"/>
-          <w:szCs w:val="19"/>
-        </w:rPr>
-        <w:t xml:space="preserve"> Hazard Rate Array</w:t>
+        <w:t>결과</w:t>
+      </w:r>
+      <w:r>
+        <w:rPr>
+          <w:rFonts w:ascii="돋움체" w:eastAsia="돋움체" w:cs="돋움체"/>
+          <w:color w:val="008000"/>
+          <w:kern w:val="0"/>
+          <w:sz w:val="19"/>
+          <w:szCs w:val="19"/>
+        </w:rPr>
+        <w:t xml:space="preserve"> [0]: Result_Spread [1]:Premium_Leg [2]:Protection Leg</w:t>
       </w:r>
     </w:p>
     <w:p>
@@ -9851,7 +10132,7 @@
         <w:wordWrap/>
         <w:adjustRightInd w:val="0"/>
         <w:spacing w:after="0" w:line="240" w:lineRule="auto"/>
-        <w:ind w:leftChars="200" w:left="400"/>
+        <w:ind w:firstLineChars="200" w:firstLine="380"/>
         <w:jc w:val="left"/>
         <w:rPr>
           <w:rFonts w:ascii="돋움체" w:eastAsia="돋움체" w:cs="돋움체"/>
@@ -9889,7 +10170,7 @@
           <w:sz w:val="19"/>
           <w:szCs w:val="19"/>
         </w:rPr>
-        <w:t>ResultGreeks</w:t>
+        <w:t>ResultHazardRate</w:t>
       </w:r>
       <w:r>
         <w:rPr>
@@ -9914,42 +10195,32 @@
       <w:r>
         <w:rPr>
           <w:rFonts w:ascii="돋움체" w:eastAsia="돋움체" w:cs="돋움체"/>
-          <w:color w:val="000000"/>
-          <w:kern w:val="0"/>
-          <w:sz w:val="19"/>
-          <w:szCs w:val="19"/>
-        </w:rPr>
-        <w:tab/>
-      </w:r>
-      <w:r>
-        <w:rPr>
-          <w:rFonts w:ascii="돋움체" w:eastAsia="돋움체" w:cs="돋움체"/>
-          <w:color w:val="008000"/>
-          <w:kern w:val="0"/>
-          <w:sz w:val="19"/>
-          <w:szCs w:val="19"/>
-        </w:rPr>
-        <w:t>// [0~2]IR PV01 Net, Pre, Pro [3~5]</w:t>
-      </w:r>
-      <w:r>
-        <w:rPr>
-          <w:rFonts w:ascii="돋움체" w:eastAsia="돋움체" w:cs="돋움체" w:hint="eastAsia"/>
-          <w:color w:val="008000"/>
-          <w:kern w:val="0"/>
-          <w:sz w:val="19"/>
-          <w:szCs w:val="19"/>
-        </w:rPr>
-        <w:t>부도율</w:t>
-      </w:r>
-      <w:r>
-        <w:rPr>
-          <w:rFonts w:ascii="돋움체" w:eastAsia="돋움체" w:cs="돋움체"/>
-          <w:color w:val="008000"/>
-          <w:kern w:val="0"/>
-          <w:sz w:val="19"/>
-          <w:szCs w:val="19"/>
-        </w:rPr>
-        <w:t xml:space="preserve"> PV01 Net, Pre, Pro </w:t>
+          <w:color w:val="008000"/>
+          <w:kern w:val="0"/>
+          <w:sz w:val="19"/>
+          <w:szCs w:val="19"/>
+        </w:rPr>
+        <w:t xml:space="preserve">// </w:t>
+      </w:r>
+      <w:r>
+        <w:rPr>
+          <w:rFonts w:ascii="돋움체" w:eastAsia="돋움체" w:cs="돋움체" w:hint="eastAsia"/>
+          <w:color w:val="008000"/>
+          <w:kern w:val="0"/>
+          <w:sz w:val="19"/>
+          <w:szCs w:val="19"/>
+        </w:rPr>
+        <w:t>산출된</w:t>
+      </w:r>
+      <w:r>
+        <w:rPr>
+          <w:rFonts w:ascii="돋움체" w:eastAsia="돋움체" w:cs="돋움체"/>
+          <w:color w:val="008000"/>
+          <w:kern w:val="0"/>
+          <w:sz w:val="19"/>
+          <w:szCs w:val="19"/>
+        </w:rPr>
+        <w:t xml:space="preserve"> Hazard Rate Array</w:t>
       </w:r>
     </w:p>
     <w:p>
@@ -9957,7 +10228,7 @@
         <w:wordWrap/>
         <w:adjustRightInd w:val="0"/>
         <w:spacing w:after="0" w:line="240" w:lineRule="auto"/>
-        <w:ind w:leftChars="200" w:left="400"/>
+        <w:ind w:firstLineChars="200" w:firstLine="380"/>
         <w:jc w:val="left"/>
         <w:rPr>
           <w:rFonts w:ascii="돋움체" w:eastAsia="돋움체" w:cs="돋움체"/>
@@ -9995,6 +10266,112 @@
           <w:sz w:val="19"/>
           <w:szCs w:val="19"/>
         </w:rPr>
+        <w:t>ResultGreeks</w:t>
+      </w:r>
+      <w:r>
+        <w:rPr>
+          <w:rFonts w:ascii="돋움체" w:eastAsia="돋움체" w:cs="돋움체"/>
+          <w:color w:val="000000"/>
+          <w:kern w:val="0"/>
+          <w:sz w:val="19"/>
+          <w:szCs w:val="19"/>
+        </w:rPr>
+        <w:t>,</w:t>
+      </w:r>
+      <w:r>
+        <w:rPr>
+          <w:rFonts w:ascii="돋움체" w:eastAsia="돋움체" w:cs="돋움체"/>
+          <w:color w:val="000000"/>
+          <w:kern w:val="0"/>
+          <w:sz w:val="19"/>
+          <w:szCs w:val="19"/>
+        </w:rPr>
+        <w:tab/>
+      </w:r>
+      <w:r>
+        <w:rPr>
+          <w:rFonts w:ascii="돋움체" w:eastAsia="돋움체" w:cs="돋움체"/>
+          <w:color w:val="000000"/>
+          <w:kern w:val="0"/>
+          <w:sz w:val="19"/>
+          <w:szCs w:val="19"/>
+        </w:rPr>
+        <w:tab/>
+      </w:r>
+      <w:r>
+        <w:rPr>
+          <w:rFonts w:ascii="돋움체" w:eastAsia="돋움체" w:cs="돋움체"/>
+          <w:color w:val="008000"/>
+          <w:kern w:val="0"/>
+          <w:sz w:val="19"/>
+          <w:szCs w:val="19"/>
+        </w:rPr>
+        <w:t>// [0~2]IR PV01 Net, Pre, Pro [3~5]</w:t>
+      </w:r>
+      <w:r>
+        <w:rPr>
+          <w:rFonts w:ascii="돋움체" w:eastAsia="돋움체" w:cs="돋움체" w:hint="eastAsia"/>
+          <w:color w:val="008000"/>
+          <w:kern w:val="0"/>
+          <w:sz w:val="19"/>
+          <w:szCs w:val="19"/>
+        </w:rPr>
+        <w:t>부도율</w:t>
+      </w:r>
+      <w:r>
+        <w:rPr>
+          <w:rFonts w:ascii="돋움체" w:eastAsia="돋움체" w:cs="돋움체"/>
+          <w:color w:val="008000"/>
+          <w:kern w:val="0"/>
+          <w:sz w:val="19"/>
+          <w:szCs w:val="19"/>
+        </w:rPr>
+        <w:t xml:space="preserve"> PV01 Net, Pre, Pro </w:t>
+      </w:r>
+    </w:p>
+    <w:p>
+      <w:pPr>
+        <w:wordWrap/>
+        <w:adjustRightInd w:val="0"/>
+        <w:spacing w:after="0" w:line="240" w:lineRule="auto"/>
+        <w:ind w:firstLineChars="200" w:firstLine="380"/>
+        <w:jc w:val="left"/>
+        <w:rPr>
+          <w:rFonts w:ascii="돋움체" w:eastAsia="돋움체" w:cs="돋움체"/>
+          <w:color w:val="000000"/>
+          <w:kern w:val="0"/>
+          <w:sz w:val="19"/>
+          <w:szCs w:val="19"/>
+        </w:rPr>
+      </w:pPr>
+      <w:r>
+        <w:rPr>
+          <w:rFonts w:ascii="돋움체" w:eastAsia="돋움체" w:cs="돋움체"/>
+          <w:color w:val="0000FF"/>
+          <w:kern w:val="0"/>
+          <w:sz w:val="19"/>
+          <w:szCs w:val="19"/>
+        </w:rPr>
+        <w:t>double</w:t>
+      </w:r>
+      <w:r>
+        <w:rPr>
+          <w:rFonts w:ascii="돋움체" w:eastAsia="돋움체" w:cs="돋움체"/>
+          <w:color w:val="000000"/>
+          <w:kern w:val="0"/>
+          <w:sz w:val="19"/>
+          <w:szCs w:val="19"/>
+        </w:rPr>
+        <w:t xml:space="preserve">* </w:t>
+      </w:r>
+      <w:r>
+        <w:rPr>
+          <w:rFonts w:ascii="돋움체" w:eastAsia="돋움체" w:cs="돋움체"/>
+          <w:color w:val="808080"/>
+          <w:kern w:val="0"/>
+          <w:sz w:val="19"/>
+          <w:szCs w:val="19"/>
+        </w:rPr>
         <w:t>Premium_Schedule</w:t>
       </w:r>
       <w:r>
@@ -10050,10 +10427,14 @@
     </w:p>
     <w:p>
       <w:pPr>
-        <w:ind w:leftChars="200" w:left="400"/>
-        <w:rPr>
-          <w:rFonts w:ascii="돋움체" w:eastAsia="돋움체" w:cs="돋움체"/>
-          <w:color w:val="008000"/>
+        <w:wordWrap/>
+        <w:adjustRightInd w:val="0"/>
+        <w:spacing w:after="0" w:line="240" w:lineRule="auto"/>
+        <w:ind w:firstLineChars="200" w:firstLine="380"/>
+        <w:jc w:val="left"/>
+        <w:rPr>
+          <w:rFonts w:ascii="돋움체" w:eastAsia="돋움체" w:cs="돋움체"/>
+          <w:color w:val="000000"/>
           <w:kern w:val="0"/>
           <w:sz w:val="19"/>
           <w:szCs w:val="19"/>
@@ -10109,6 +10490,8 @@
         </w:rPr>
         <w:tab/>
       </w:r>
+      <w:bookmarkStart w:id="0" w:name="_GoBack"/>
+      <w:bookmarkEnd w:id="0"/>
       <w:r>
         <w:rPr>
           <w:rFonts w:ascii="돋움체" w:eastAsia="돋움체" w:cs="돋움체"/>
@@ -10150,17 +10533,6 @@
         </w:rPr>
         <w:t>)</w:t>
       </w:r>
-    </w:p>
-    <w:p>
-      <w:pPr>
-        <w:rPr>
-          <w:rFonts w:ascii="돋움체" w:eastAsia="돋움체" w:cs="돋움체"/>
-          <w:color w:val="000000"/>
-          <w:kern w:val="0"/>
-          <w:sz w:val="19"/>
-          <w:szCs w:val="19"/>
-        </w:rPr>
-      </w:pPr>
     </w:p>
     <w:p>
       <w:pPr>

</xml_diff>